<commit_message>
Revised report with minimal corrections
</commit_message>
<xml_diff>
--- a/Izvestaj.docx
+++ b/Izvestaj.docx
@@ -84,7 +84,7 @@
                     </pic:cNvPicPr>
                   </pic:nvPicPr>
                   <pic:blipFill>
-                    <a:blip r:embed="rId6" cstate="print"/>
+                    <a:blip r:embed="rId8" cstate="print"/>
                     <a:srcRect/>
                     <a:stretch>
                       <a:fillRect/>
@@ -144,7 +144,33 @@
         <w:rPr>
           <w:rFonts w:ascii="Times New Roman" w:hAnsi="Times New Roman"/>
         </w:rPr>
-        <w:t>Класификација политичких ставова у коментарима на друштвеним мрежама о студентским протестима у Србији</w:t>
+        <w:t xml:space="preserve">Класификација политичких ставова </w:t>
+      </w:r>
+      <w:r>
+        <w:rPr>
+          <w:rFonts w:ascii="Times New Roman" w:hAnsi="Times New Roman"/>
+          <w:lang w:val="sr-Cyrl-RS"/>
+        </w:rPr>
+        <w:t xml:space="preserve">према власти у </w:t>
+      </w:r>
+      <w:r>
+        <w:rPr>
+          <w:rFonts w:ascii="Times New Roman" w:hAnsi="Times New Roman"/>
+        </w:rPr>
+        <w:t>коментарима на друштвеним</w:t>
+      </w:r>
+      <w:r>
+        <w:rPr>
+          <w:rFonts w:ascii="Times New Roman" w:hAnsi="Times New Roman"/>
+          <w:lang w:val="sr-Cyrl-RS"/>
+        </w:rPr>
+        <w:t xml:space="preserve"> мрежама у Србији</w:t>
+      </w:r>
+      <w:r>
+        <w:rPr>
+          <w:rFonts w:ascii="Times New Roman" w:hAnsi="Times New Roman"/>
+        </w:rPr>
+        <w:t xml:space="preserve"> </w:t>
       </w:r>
     </w:p>
     <w:p>
@@ -153,7 +179,7 @@
         <w:rPr>
           <w:rFonts w:ascii="Times New Roman" w:hAnsi="Times New Roman"/>
           <w:sz w:val="28"/>
-          <w:lang w:val="sr-Cyrl-CS"/>
+          <w:lang w:val="sr-Cyrl-RS"/>
         </w:rPr>
       </w:pPr>
       <w:r>
@@ -394,7 +420,7 @@
           <w:r>
             <w:fldChar w:fldCharType="separate"/>
           </w:r>
-          <w:hyperlink w:anchor="_Toc239505103" w:history="1">
+          <w:hyperlink w:anchor="_Toc239590082" w:history="1">
             <w:r>
               <w:rPr>
                 <w:rStyle w:val="Hyperlink"/>
@@ -436,7 +462,7 @@
                 <w:noProof/>
                 <w:webHidden/>
               </w:rPr>
-              <w:instrText xml:space="preserve"> PAGEREF _Toc239505103 \h </w:instrText>
+              <w:instrText xml:space="preserve"> PAGEREF _Toc239590082 \h </w:instrText>
             </w:r>
             <w:r>
               <w:rPr>
@@ -456,7 +482,7 @@
                 <w:noProof/>
                 <w:webHidden/>
               </w:rPr>
-              <w:t>3</w:t>
+              <w:t>2</w:t>
             </w:r>
             <w:r>
               <w:rPr>
@@ -481,7 +507,7 @@
               <w14:ligatures w14:val="standardContextual"/>
             </w:rPr>
           </w:pPr>
-          <w:hyperlink w:anchor="_Toc239505104" w:history="1">
+          <w:hyperlink w:anchor="_Toc239590083" w:history="1">
             <w:r>
               <w:rPr>
                 <w:rStyle w:val="Hyperlink"/>
@@ -508,7 +534,7 @@
                 <w:noProof/>
                 <w:webHidden/>
               </w:rPr>
-              <w:instrText xml:space="preserve"> PAGEREF _Toc239505104 \h </w:instrText>
+              <w:instrText xml:space="preserve"> PAGEREF _Toc239590083 \h </w:instrText>
             </w:r>
             <w:r>
               <w:rPr>
@@ -528,7 +554,7 @@
                 <w:noProof/>
                 <w:webHidden/>
               </w:rPr>
-              <w:t>3</w:t>
+              <w:t>2</w:t>
             </w:r>
             <w:r>
               <w:rPr>
@@ -553,7 +579,7 @@
               <w14:ligatures w14:val="standardContextual"/>
             </w:rPr>
           </w:pPr>
-          <w:hyperlink w:anchor="_Toc239505105" w:history="1">
+          <w:hyperlink w:anchor="_Toc239590084" w:history="1">
             <w:r>
               <w:rPr>
                 <w:rStyle w:val="Hyperlink"/>
@@ -580,7 +606,7 @@
                 <w:noProof/>
                 <w:webHidden/>
               </w:rPr>
-              <w:instrText xml:space="preserve"> PAGEREF _Toc239505105 \h </w:instrText>
+              <w:instrText xml:space="preserve"> PAGEREF _Toc239590084 \h </w:instrText>
             </w:r>
             <w:r>
               <w:rPr>
@@ -600,7 +626,7 @@
                 <w:noProof/>
                 <w:webHidden/>
               </w:rPr>
-              <w:t>4</w:t>
+              <w:t>3</w:t>
             </w:r>
             <w:r>
               <w:rPr>
@@ -625,7 +651,7 @@
               <w14:ligatures w14:val="standardContextual"/>
             </w:rPr>
           </w:pPr>
-          <w:hyperlink w:anchor="_Toc239505106" w:history="1">
+          <w:hyperlink w:anchor="_Toc239590085" w:history="1">
             <w:r>
               <w:rPr>
                 <w:rStyle w:val="Hyperlink"/>
@@ -660,7 +686,7 @@
                 <w:noProof/>
                 <w:webHidden/>
               </w:rPr>
-              <w:instrText xml:space="preserve"> PAGEREF _Toc239505106 \h </w:instrText>
+              <w:instrText xml:space="preserve"> PAGEREF _Toc239590085 \h </w:instrText>
             </w:r>
             <w:r>
               <w:rPr>
@@ -680,7 +706,7 @@
                 <w:noProof/>
                 <w:webHidden/>
               </w:rPr>
-              <w:t>5</w:t>
+              <w:t>4</w:t>
             </w:r>
             <w:r>
               <w:rPr>
@@ -705,7 +731,7 @@
               <w14:ligatures w14:val="standardContextual"/>
             </w:rPr>
           </w:pPr>
-          <w:hyperlink w:anchor="_Toc239505107" w:history="1">
+          <w:hyperlink w:anchor="_Toc239590086" w:history="1">
             <w:r>
               <w:rPr>
                 <w:rStyle w:val="Hyperlink"/>
@@ -747,7 +773,7 @@
                 <w:noProof/>
                 <w:webHidden/>
               </w:rPr>
-              <w:instrText xml:space="preserve"> PAGEREF _Toc239505107 \h </w:instrText>
+              <w:instrText xml:space="preserve"> PAGEREF _Toc239590086 \h </w:instrText>
             </w:r>
             <w:r>
               <w:rPr>
@@ -767,7 +793,7 @@
                 <w:noProof/>
                 <w:webHidden/>
               </w:rPr>
-              <w:t>5</w:t>
+              <w:t>4</w:t>
             </w:r>
             <w:r>
               <w:rPr>
@@ -792,7 +818,7 @@
               <w14:ligatures w14:val="standardContextual"/>
             </w:rPr>
           </w:pPr>
-          <w:hyperlink w:anchor="_Toc239505108" w:history="1">
+          <w:hyperlink w:anchor="_Toc239590087" w:history="1">
             <w:r>
               <w:rPr>
                 <w:rStyle w:val="Hyperlink"/>
@@ -875,7 +901,7 @@
                 <w:noProof/>
                 <w:webHidden/>
               </w:rPr>
-              <w:instrText xml:space="preserve"> PAGEREF _Toc239505108 \h </w:instrText>
+              <w:instrText xml:space="preserve"> PAGEREF _Toc239590087 \h </w:instrText>
             </w:r>
             <w:r>
               <w:rPr>
@@ -895,7 +921,7 @@
                 <w:noProof/>
                 <w:webHidden/>
               </w:rPr>
-              <w:t>6</w:t>
+              <w:t>5</w:t>
             </w:r>
             <w:r>
               <w:rPr>
@@ -920,7 +946,7 @@
               <w14:ligatures w14:val="standardContextual"/>
             </w:rPr>
           </w:pPr>
-          <w:hyperlink w:anchor="_Toc239505109" w:history="1">
+          <w:hyperlink w:anchor="_Toc239590088" w:history="1">
             <w:r>
               <w:rPr>
                 <w:rStyle w:val="Hyperlink"/>
@@ -980,7 +1006,7 @@
                 <w:noProof/>
                 <w:webHidden/>
               </w:rPr>
-              <w:instrText xml:space="preserve"> PAGEREF _Toc239505109 \h </w:instrText>
+              <w:instrText xml:space="preserve"> PAGEREF _Toc239590088 \h </w:instrText>
             </w:r>
             <w:r>
               <w:rPr>
@@ -1000,7 +1026,7 @@
                 <w:noProof/>
                 <w:webHidden/>
               </w:rPr>
-              <w:t>7</w:t>
+              <w:t>6</w:t>
             </w:r>
             <w:r>
               <w:rPr>
@@ -1025,7 +1051,7 @@
               <w14:ligatures w14:val="standardContextual"/>
             </w:rPr>
           </w:pPr>
-          <w:hyperlink w:anchor="_Toc239505110" w:history="1">
+          <w:hyperlink w:anchor="_Toc239590089" w:history="1">
             <w:r>
               <w:rPr>
                 <w:rStyle w:val="Hyperlink"/>
@@ -1093,7 +1119,7 @@
                 <w:noProof/>
                 <w:webHidden/>
               </w:rPr>
-              <w:instrText xml:space="preserve"> PAGEREF _Toc239505110 \h </w:instrText>
+              <w:instrText xml:space="preserve"> PAGEREF _Toc239590089 \h </w:instrText>
             </w:r>
             <w:r>
               <w:rPr>
@@ -1113,7 +1139,7 @@
                 <w:noProof/>
                 <w:webHidden/>
               </w:rPr>
-              <w:t>7</w:t>
+              <w:t>6</w:t>
             </w:r>
             <w:r>
               <w:rPr>
@@ -1138,7 +1164,7 @@
               <w14:ligatures w14:val="standardContextual"/>
             </w:rPr>
           </w:pPr>
-          <w:hyperlink w:anchor="_Toc239505111" w:history="1">
+          <w:hyperlink w:anchor="_Toc239590090" w:history="1">
             <w:r>
               <w:rPr>
                 <w:rStyle w:val="Hyperlink"/>
@@ -1165,7 +1191,7 @@
                 <w:noProof/>
                 <w:webHidden/>
               </w:rPr>
-              <w:instrText xml:space="preserve"> PAGEREF _Toc239505111 \h </w:instrText>
+              <w:instrText xml:space="preserve"> PAGEREF _Toc239590090 \h </w:instrText>
             </w:r>
             <w:r>
               <w:rPr>
@@ -1185,7 +1211,7 @@
                 <w:noProof/>
                 <w:webHidden/>
               </w:rPr>
-              <w:t>8</w:t>
+              <w:t>7</w:t>
             </w:r>
             <w:r>
               <w:rPr>
@@ -1210,7 +1236,7 @@
               <w14:ligatures w14:val="standardContextual"/>
             </w:rPr>
           </w:pPr>
-          <w:hyperlink w:anchor="_Toc239505112" w:history="1">
+          <w:hyperlink w:anchor="_Toc239590091" w:history="1">
             <w:r>
               <w:rPr>
                 <w:rStyle w:val="Hyperlink"/>
@@ -1252,7 +1278,7 @@
                 <w:noProof/>
                 <w:webHidden/>
               </w:rPr>
-              <w:instrText xml:space="preserve"> PAGEREF _Toc239505112 \h </w:instrText>
+              <w:instrText xml:space="preserve"> PAGEREF _Toc239590091 \h </w:instrText>
             </w:r>
             <w:r>
               <w:rPr>
@@ -1272,7 +1298,7 @@
                 <w:noProof/>
                 <w:webHidden/>
               </w:rPr>
-              <w:t>8</w:t>
+              <w:t>7</w:t>
             </w:r>
             <w:r>
               <w:rPr>
@@ -1297,7 +1323,7 @@
               <w14:ligatures w14:val="standardContextual"/>
             </w:rPr>
           </w:pPr>
-          <w:hyperlink w:anchor="_Toc239505113" w:history="1">
+          <w:hyperlink w:anchor="_Toc239590092" w:history="1">
             <w:r>
               <w:rPr>
                 <w:rStyle w:val="Hyperlink"/>
@@ -1324,7 +1350,7 @@
                 <w:noProof/>
                 <w:webHidden/>
               </w:rPr>
-              <w:instrText xml:space="preserve"> PAGEREF _Toc239505113 \h </w:instrText>
+              <w:instrText xml:space="preserve"> PAGEREF _Toc239590092 \h </w:instrText>
             </w:r>
             <w:r>
               <w:rPr>
@@ -1344,7 +1370,7 @@
                 <w:noProof/>
                 <w:webHidden/>
               </w:rPr>
-              <w:t>8</w:t>
+              <w:t>7</w:t>
             </w:r>
             <w:r>
               <w:rPr>
@@ -1369,7 +1395,7 @@
               <w14:ligatures w14:val="standardContextual"/>
             </w:rPr>
           </w:pPr>
-          <w:hyperlink w:anchor="_Toc239505114" w:history="1">
+          <w:hyperlink w:anchor="_Toc239590093" w:history="1">
             <w:r>
               <w:rPr>
                 <w:rStyle w:val="Hyperlink"/>
@@ -1411,7 +1437,7 @@
                 <w:noProof/>
                 <w:webHidden/>
               </w:rPr>
-              <w:instrText xml:space="preserve"> PAGEREF _Toc239505114 \h </w:instrText>
+              <w:instrText xml:space="preserve"> PAGEREF _Toc239590093 \h </w:instrText>
             </w:r>
             <w:r>
               <w:rPr>
@@ -1431,7 +1457,7 @@
                 <w:noProof/>
                 <w:webHidden/>
               </w:rPr>
-              <w:t>9</w:t>
+              <w:t>8</w:t>
             </w:r>
             <w:r>
               <w:rPr>
@@ -1456,7 +1482,7 @@
               <w14:ligatures w14:val="standardContextual"/>
             </w:rPr>
           </w:pPr>
-          <w:hyperlink w:anchor="_Toc239505115" w:history="1">
+          <w:hyperlink w:anchor="_Toc239590094" w:history="1">
             <w:r>
               <w:rPr>
                 <w:rStyle w:val="Hyperlink"/>
@@ -1483,7 +1509,7 @@
                 <w:noProof/>
                 <w:webHidden/>
               </w:rPr>
-              <w:instrText xml:space="preserve"> PAGEREF _Toc239505115 \h </w:instrText>
+              <w:instrText xml:space="preserve"> PAGEREF _Toc239590094 \h </w:instrText>
             </w:r>
             <w:r>
               <w:rPr>
@@ -1503,7 +1529,7 @@
                 <w:noProof/>
                 <w:webHidden/>
               </w:rPr>
-              <w:t>9</w:t>
+              <w:t>8</w:t>
             </w:r>
             <w:r>
               <w:rPr>
@@ -1528,7 +1554,7 @@
               <w14:ligatures w14:val="standardContextual"/>
             </w:rPr>
           </w:pPr>
-          <w:hyperlink w:anchor="_Toc239505116" w:history="1">
+          <w:hyperlink w:anchor="_Toc239590095" w:history="1">
             <w:r>
               <w:rPr>
                 <w:rStyle w:val="Hyperlink"/>
@@ -1555,7 +1581,7 @@
                 <w:noProof/>
                 <w:webHidden/>
               </w:rPr>
-              <w:instrText xml:space="preserve"> PAGEREF _Toc239505116 \h </w:instrText>
+              <w:instrText xml:space="preserve"> PAGEREF _Toc239590095 \h </w:instrText>
             </w:r>
             <w:r>
               <w:rPr>
@@ -1575,359 +1601,7 @@
                 <w:noProof/>
                 <w:webHidden/>
               </w:rPr>
-              <w:t>9</w:t>
-            </w:r>
-            <w:r>
-              <w:rPr>
-                <w:noProof/>
-                <w:webHidden/>
-              </w:rPr>
-              <w:fldChar w:fldCharType="end"/>
-            </w:r>
-          </w:hyperlink>
-        </w:p>
-        <w:p>
-          <w:pPr>
-            <w:pStyle w:val="TOC3"/>
-            <w:tabs>
-              <w:tab w:val="right" w:leader="dot" w:pos="9350"/>
-            </w:tabs>
-            <w:rPr>
-              <w:noProof/>
-            </w:rPr>
-          </w:pPr>
-          <w:hyperlink w:anchor="_Toc239505117" w:history="1">
-            <w:r>
-              <w:rPr>
-                <w:rStyle w:val="Hyperlink"/>
-                <w:noProof/>
-              </w:rPr>
-              <w:t>2.3.1. Калибрација и мере слагања</w:t>
-            </w:r>
-            <w:r>
-              <w:rPr>
-                <w:noProof/>
-                <w:webHidden/>
-              </w:rPr>
-              <w:tab/>
-            </w:r>
-            <w:r>
-              <w:rPr>
-                <w:noProof/>
-                <w:webHidden/>
-              </w:rPr>
-              <w:fldChar w:fldCharType="begin"/>
-            </w:r>
-            <w:r>
-              <w:rPr>
-                <w:noProof/>
-                <w:webHidden/>
-              </w:rPr>
-              <w:instrText xml:space="preserve"> PAGEREF _Toc239505117 \h </w:instrText>
-            </w:r>
-            <w:r>
-              <w:rPr>
-                <w:noProof/>
-                <w:webHidden/>
-              </w:rPr>
-            </w:r>
-            <w:r>
-              <w:rPr>
-                <w:noProof/>
-                <w:webHidden/>
-              </w:rPr>
-              <w:fldChar w:fldCharType="separate"/>
-            </w:r>
-            <w:r>
-              <w:rPr>
-                <w:noProof/>
-                <w:webHidden/>
-              </w:rPr>
-              <w:t>10</w:t>
-            </w:r>
-            <w:r>
-              <w:rPr>
-                <w:noProof/>
-                <w:webHidden/>
-              </w:rPr>
-              <w:fldChar w:fldCharType="end"/>
-            </w:r>
-          </w:hyperlink>
-        </w:p>
-        <w:p>
-          <w:pPr>
-            <w:pStyle w:val="TOC2"/>
-            <w:tabs>
-              <w:tab w:val="right" w:leader="dot" w:pos="9350"/>
-            </w:tabs>
-            <w:rPr>
-              <w:rFonts w:asciiTheme="minorHAnsi" w:eastAsiaTheme="minorEastAsia" w:hAnsiTheme="minorHAnsi" w:cstheme="minorBidi"/>
-              <w:noProof/>
-              <w:kern w:val="2"/>
-              <w:lang w:val="en-US"/>
-            </w:rPr>
-          </w:pPr>
-          <w:hyperlink w:anchor="_2.4._Експлоративна_анализа" w:history="1">
-            <w:r>
-              <w:rPr>
-                <w:rStyle w:val="Hyperlink"/>
-                <w:noProof/>
-              </w:rPr>
-              <w:t>2.</w:t>
-            </w:r>
-            <w:r>
-              <w:rPr>
-                <w:rStyle w:val="Hyperlink"/>
-                <w:noProof/>
-              </w:rPr>
-              <w:t>4</w:t>
-            </w:r>
-            <w:r>
-              <w:rPr>
-                <w:rStyle w:val="Hyperlink"/>
-                <w:noProof/>
-              </w:rPr>
-              <w:t xml:space="preserve">. </w:t>
-            </w:r>
-            <w:r>
-              <w:rPr>
-                <w:rStyle w:val="Hyperlink"/>
-                <w:noProof/>
-              </w:rPr>
-              <w:t>Експлоративна анализа података</w:t>
-            </w:r>
-            <w:r>
-              <w:rPr>
-                <w:noProof/>
-                <w:webHidden/>
-              </w:rPr>
-              <w:tab/>
-            </w:r>
-            <w:r>
-              <w:rPr>
-                <w:noProof/>
-                <w:webHidden/>
-              </w:rPr>
-              <w:fldChar w:fldCharType="begin"/>
-            </w:r>
-            <w:r>
-              <w:rPr>
-                <w:noProof/>
-                <w:webHidden/>
-              </w:rPr>
-              <w:instrText xml:space="preserve"> PAGEREF _Toc239505116 \h </w:instrText>
-            </w:r>
-            <w:r>
-              <w:rPr>
-                <w:noProof/>
-                <w:webHidden/>
-              </w:rPr>
-            </w:r>
-            <w:r>
-              <w:rPr>
-                <w:noProof/>
-                <w:webHidden/>
-              </w:rPr>
-              <w:fldChar w:fldCharType="separate"/>
-            </w:r>
-            <w:r>
-              <w:rPr>
-                <w:noProof/>
-                <w:webHidden/>
-              </w:rPr>
-              <w:t>9</w:t>
-            </w:r>
-            <w:r>
-              <w:rPr>
-                <w:noProof/>
-                <w:webHidden/>
-              </w:rPr>
-              <w:fldChar w:fldCharType="end"/>
-            </w:r>
-          </w:hyperlink>
-        </w:p>
-        <w:p>
-          <w:pPr>
-            <w:pStyle w:val="TOC3"/>
-            <w:tabs>
-              <w:tab w:val="right" w:leader="dot" w:pos="9350"/>
-            </w:tabs>
-            <w:rPr>
-              <w:noProof/>
-            </w:rPr>
-          </w:pPr>
-          <w:hyperlink w:anchor="_2.4.1._Расподела_по" w:history="1">
-            <w:r>
-              <w:rPr>
-                <w:rStyle w:val="Hyperlink"/>
-                <w:noProof/>
-              </w:rPr>
-              <w:t>2.</w:t>
-            </w:r>
-            <w:r>
-              <w:rPr>
-                <w:rStyle w:val="Hyperlink"/>
-                <w:noProof/>
-              </w:rPr>
-              <w:t>4</w:t>
-            </w:r>
-            <w:r>
-              <w:rPr>
-                <w:rStyle w:val="Hyperlink"/>
-                <w:noProof/>
-              </w:rPr>
-              <w:t xml:space="preserve">.1. </w:t>
-            </w:r>
-            <w:r>
-              <w:rPr>
-                <w:rStyle w:val="Hyperlink"/>
-                <w:noProof/>
-              </w:rPr>
-              <w:t>Расподела по платформама</w:t>
-            </w:r>
-            <w:r>
-              <w:rPr>
-                <w:noProof/>
-                <w:webHidden/>
-              </w:rPr>
-              <w:tab/>
-            </w:r>
-            <w:r>
-              <w:rPr>
-                <w:noProof/>
-                <w:webHidden/>
-              </w:rPr>
-              <w:fldChar w:fldCharType="begin"/>
-            </w:r>
-            <w:r>
-              <w:rPr>
-                <w:noProof/>
-                <w:webHidden/>
-              </w:rPr>
-              <w:instrText xml:space="preserve"> PAGEREF _Toc239505117 \h </w:instrText>
-            </w:r>
-            <w:r>
-              <w:rPr>
-                <w:noProof/>
-                <w:webHidden/>
-              </w:rPr>
-            </w:r>
-            <w:r>
-              <w:rPr>
-                <w:noProof/>
-                <w:webHidden/>
-              </w:rPr>
-              <w:fldChar w:fldCharType="separate"/>
-            </w:r>
-            <w:r>
-              <w:rPr>
-                <w:noProof/>
-                <w:webHidden/>
-              </w:rPr>
-              <w:t>10</w:t>
-            </w:r>
-            <w:r>
-              <w:rPr>
-                <w:noProof/>
-                <w:webHidden/>
-              </w:rPr>
-              <w:fldChar w:fldCharType="end"/>
-            </w:r>
-          </w:hyperlink>
-        </w:p>
-        <w:p>
-          <w:pPr>
-            <w:pStyle w:val="TOC3"/>
-            <w:tabs>
-              <w:tab w:val="right" w:leader="dot" w:pos="9350"/>
-            </w:tabs>
-            <w:rPr>
-              <w:noProof/>
-            </w:rPr>
-          </w:pPr>
-          <w:hyperlink w:anchor="_2.4.2._Дужина_коментара" w:history="1">
-            <w:r>
-              <w:rPr>
-                <w:rStyle w:val="Hyperlink"/>
-                <w:noProof/>
-              </w:rPr>
-              <w:t>2.</w:t>
-            </w:r>
-            <w:r>
-              <w:rPr>
-                <w:rStyle w:val="Hyperlink"/>
-                <w:noProof/>
-              </w:rPr>
-              <w:t>4</w:t>
-            </w:r>
-            <w:r>
-              <w:rPr>
-                <w:rStyle w:val="Hyperlink"/>
-                <w:noProof/>
-              </w:rPr>
-              <w:t>.</w:t>
-            </w:r>
-            <w:r>
-              <w:rPr>
-                <w:rStyle w:val="Hyperlink"/>
-                <w:noProof/>
-              </w:rPr>
-              <w:t>2</w:t>
-            </w:r>
-            <w:r>
-              <w:rPr>
-                <w:rStyle w:val="Hyperlink"/>
-                <w:noProof/>
-              </w:rPr>
-              <w:t xml:space="preserve">. </w:t>
-            </w:r>
-            <w:r>
-              <w:rPr>
-                <w:rStyle w:val="Hyperlink"/>
-                <w:noProof/>
-              </w:rPr>
-              <w:t>Дужина коментара</w:t>
-            </w:r>
-            <w:r>
-              <w:rPr>
-                <w:noProof/>
-                <w:webHidden/>
-              </w:rPr>
-              <w:tab/>
-            </w:r>
-            <w:r>
-              <w:rPr>
-                <w:noProof/>
-                <w:webHidden/>
-              </w:rPr>
-              <w:fldChar w:fldCharType="begin"/>
-            </w:r>
-            <w:r>
-              <w:rPr>
-                <w:noProof/>
-                <w:webHidden/>
-              </w:rPr>
-              <w:instrText xml:space="preserve"> PAGEREF _Toc239505117 \h </w:instrText>
-            </w:r>
-            <w:r>
-              <w:rPr>
-                <w:noProof/>
-                <w:webHidden/>
-              </w:rPr>
-            </w:r>
-            <w:r>
-              <w:rPr>
-                <w:noProof/>
-                <w:webHidden/>
-              </w:rPr>
-              <w:fldChar w:fldCharType="separate"/>
-            </w:r>
-            <w:r>
-              <w:rPr>
-                <w:noProof/>
-                <w:webHidden/>
-              </w:rPr>
-              <w:t>10</w:t>
+              <w:t>8</w:t>
             </w:r>
             <w:r>
               <w:rPr>
@@ -1952,12 +1626,300 @@
               <w14:ligatures w14:val="standardContextual"/>
             </w:rPr>
           </w:pPr>
-          <w:hyperlink w:anchor="_Toc239505118" w:history="1">
+          <w:hyperlink w:anchor="_Toc239590096" w:history="1">
             <w:r>
               <w:rPr>
                 <w:rStyle w:val="Hyperlink"/>
                 <w:noProof/>
               </w:rPr>
+              <w:t>2.3.1. Калибрација и мере слагања</w:t>
+            </w:r>
+            <w:r>
+              <w:rPr>
+                <w:noProof/>
+                <w:webHidden/>
+              </w:rPr>
+              <w:tab/>
+            </w:r>
+            <w:r>
+              <w:rPr>
+                <w:noProof/>
+                <w:webHidden/>
+              </w:rPr>
+              <w:fldChar w:fldCharType="begin"/>
+            </w:r>
+            <w:r>
+              <w:rPr>
+                <w:noProof/>
+                <w:webHidden/>
+              </w:rPr>
+              <w:instrText xml:space="preserve"> PAGEREF _Toc239590096 \h </w:instrText>
+            </w:r>
+            <w:r>
+              <w:rPr>
+                <w:noProof/>
+                <w:webHidden/>
+              </w:rPr>
+            </w:r>
+            <w:r>
+              <w:rPr>
+                <w:noProof/>
+                <w:webHidden/>
+              </w:rPr>
+              <w:fldChar w:fldCharType="separate"/>
+            </w:r>
+            <w:r>
+              <w:rPr>
+                <w:noProof/>
+                <w:webHidden/>
+              </w:rPr>
+              <w:t>9</w:t>
+            </w:r>
+            <w:r>
+              <w:rPr>
+                <w:noProof/>
+                <w:webHidden/>
+              </w:rPr>
+              <w:fldChar w:fldCharType="end"/>
+            </w:r>
+          </w:hyperlink>
+        </w:p>
+        <w:p>
+          <w:pPr>
+            <w:pStyle w:val="TOC2"/>
+            <w:tabs>
+              <w:tab w:val="right" w:leader="dot" w:pos="9350"/>
+            </w:tabs>
+            <w:rPr>
+              <w:rFonts w:asciiTheme="minorHAnsi" w:eastAsiaTheme="minorEastAsia" w:hAnsiTheme="minorHAnsi" w:cstheme="minorBidi"/>
+              <w:noProof/>
+              <w:kern w:val="2"/>
+              <w:lang w:val="en-US"/>
+              <w14:ligatures w14:val="standardContextual"/>
+            </w:rPr>
+          </w:pPr>
+          <w:hyperlink w:anchor="_Toc239590097" w:history="1">
+            <w:r>
+              <w:rPr>
+                <w:rStyle w:val="Hyperlink"/>
+                <w:noProof/>
+              </w:rPr>
+              <w:t>2.4. Експлоративна анализа података</w:t>
+            </w:r>
+            <w:r>
+              <w:rPr>
+                <w:noProof/>
+                <w:webHidden/>
+              </w:rPr>
+              <w:tab/>
+            </w:r>
+            <w:r>
+              <w:rPr>
+                <w:noProof/>
+                <w:webHidden/>
+              </w:rPr>
+              <w:fldChar w:fldCharType="begin"/>
+            </w:r>
+            <w:r>
+              <w:rPr>
+                <w:noProof/>
+                <w:webHidden/>
+              </w:rPr>
+              <w:instrText xml:space="preserve"> PAGEREF _Toc239590097 \h </w:instrText>
+            </w:r>
+            <w:r>
+              <w:rPr>
+                <w:noProof/>
+                <w:webHidden/>
+              </w:rPr>
+            </w:r>
+            <w:r>
+              <w:rPr>
+                <w:noProof/>
+                <w:webHidden/>
+              </w:rPr>
+              <w:fldChar w:fldCharType="separate"/>
+            </w:r>
+            <w:r>
+              <w:rPr>
+                <w:noProof/>
+                <w:webHidden/>
+              </w:rPr>
+              <w:t>10</w:t>
+            </w:r>
+            <w:r>
+              <w:rPr>
+                <w:noProof/>
+                <w:webHidden/>
+              </w:rPr>
+              <w:fldChar w:fldCharType="end"/>
+            </w:r>
+          </w:hyperlink>
+        </w:p>
+        <w:p>
+          <w:pPr>
+            <w:pStyle w:val="TOC3"/>
+            <w:tabs>
+              <w:tab w:val="right" w:leader="dot" w:pos="9350"/>
+            </w:tabs>
+            <w:rPr>
+              <w:rFonts w:asciiTheme="minorHAnsi" w:eastAsiaTheme="minorEastAsia" w:hAnsiTheme="minorHAnsi" w:cstheme="minorBidi"/>
+              <w:noProof/>
+              <w:kern w:val="2"/>
+              <w:lang w:val="en-US"/>
+              <w14:ligatures w14:val="standardContextual"/>
+            </w:rPr>
+          </w:pPr>
+          <w:hyperlink w:anchor="_Toc239590098" w:history="1">
+            <w:r>
+              <w:rPr>
+                <w:rStyle w:val="Hyperlink"/>
+                <w:noProof/>
+              </w:rPr>
+              <w:t>2.4.1. Расподела по платформама</w:t>
+            </w:r>
+            <w:r>
+              <w:rPr>
+                <w:noProof/>
+                <w:webHidden/>
+              </w:rPr>
+              <w:tab/>
+            </w:r>
+            <w:r>
+              <w:rPr>
+                <w:noProof/>
+                <w:webHidden/>
+              </w:rPr>
+              <w:fldChar w:fldCharType="begin"/>
+            </w:r>
+            <w:r>
+              <w:rPr>
+                <w:noProof/>
+                <w:webHidden/>
+              </w:rPr>
+              <w:instrText xml:space="preserve"> PAGEREF _Toc239590098 \h </w:instrText>
+            </w:r>
+            <w:r>
+              <w:rPr>
+                <w:noProof/>
+                <w:webHidden/>
+              </w:rPr>
+            </w:r>
+            <w:r>
+              <w:rPr>
+                <w:noProof/>
+                <w:webHidden/>
+              </w:rPr>
+              <w:fldChar w:fldCharType="separate"/>
+            </w:r>
+            <w:r>
+              <w:rPr>
+                <w:noProof/>
+                <w:webHidden/>
+              </w:rPr>
+              <w:t>12</w:t>
+            </w:r>
+            <w:r>
+              <w:rPr>
+                <w:noProof/>
+                <w:webHidden/>
+              </w:rPr>
+              <w:fldChar w:fldCharType="end"/>
+            </w:r>
+          </w:hyperlink>
+        </w:p>
+        <w:p>
+          <w:pPr>
+            <w:pStyle w:val="TOC3"/>
+            <w:tabs>
+              <w:tab w:val="right" w:leader="dot" w:pos="9350"/>
+            </w:tabs>
+            <w:rPr>
+              <w:rFonts w:asciiTheme="minorHAnsi" w:eastAsiaTheme="minorEastAsia" w:hAnsiTheme="minorHAnsi" w:cstheme="minorBidi"/>
+              <w:noProof/>
+              <w:kern w:val="2"/>
+              <w:lang w:val="en-US"/>
+              <w14:ligatures w14:val="standardContextual"/>
+            </w:rPr>
+          </w:pPr>
+          <w:hyperlink w:anchor="_Toc239590099" w:history="1">
+            <w:r>
+              <w:rPr>
+                <w:rStyle w:val="Hyperlink"/>
+                <w:noProof/>
+              </w:rPr>
+              <w:t>2.4.2. Дужина коментара</w:t>
+            </w:r>
+            <w:r>
+              <w:rPr>
+                <w:noProof/>
+                <w:webHidden/>
+              </w:rPr>
+              <w:tab/>
+            </w:r>
+            <w:r>
+              <w:rPr>
+                <w:noProof/>
+                <w:webHidden/>
+              </w:rPr>
+              <w:fldChar w:fldCharType="begin"/>
+            </w:r>
+            <w:r>
+              <w:rPr>
+                <w:noProof/>
+                <w:webHidden/>
+              </w:rPr>
+              <w:instrText xml:space="preserve"> PAGEREF _Toc239590099 \h </w:instrText>
+            </w:r>
+            <w:r>
+              <w:rPr>
+                <w:noProof/>
+                <w:webHidden/>
+              </w:rPr>
+            </w:r>
+            <w:r>
+              <w:rPr>
+                <w:noProof/>
+                <w:webHidden/>
+              </w:rPr>
+              <w:fldChar w:fldCharType="separate"/>
+            </w:r>
+            <w:r>
+              <w:rPr>
+                <w:noProof/>
+                <w:webHidden/>
+              </w:rPr>
+              <w:t>13</w:t>
+            </w:r>
+            <w:r>
+              <w:rPr>
+                <w:noProof/>
+                <w:webHidden/>
+              </w:rPr>
+              <w:fldChar w:fldCharType="end"/>
+            </w:r>
+          </w:hyperlink>
+        </w:p>
+        <w:p>
+          <w:pPr>
+            <w:pStyle w:val="TOC3"/>
+            <w:tabs>
+              <w:tab w:val="right" w:leader="dot" w:pos="9350"/>
+            </w:tabs>
+            <w:rPr>
+              <w:rFonts w:asciiTheme="minorHAnsi" w:eastAsiaTheme="minorEastAsia" w:hAnsiTheme="minorHAnsi" w:cstheme="minorBidi"/>
+              <w:noProof/>
+              <w:kern w:val="2"/>
+              <w:lang w:val="en-US"/>
+              <w14:ligatures w14:val="standardContextual"/>
+            </w:rPr>
+          </w:pPr>
+          <w:hyperlink w:anchor="_Toc239590100" w:history="1">
+            <w:r>
+              <w:rPr>
+                <w:rStyle w:val="Hyperlink"/>
+                <w:noProof/>
+              </w:rPr>
               <w:t>2.4.3. Најчешће речи — семантички отисак класа</w:t>
             </w:r>
             <w:r>
@@ -1979,7 +1941,7 @@
                 <w:noProof/>
                 <w:webHidden/>
               </w:rPr>
-              <w:instrText xml:space="preserve"> PAGEREF _Toc239505118 \h </w:instrText>
+              <w:instrText xml:space="preserve"> PAGEREF _Toc239590100 \h </w:instrText>
             </w:r>
             <w:r>
               <w:rPr>
@@ -1999,7 +1961,7 @@
                 <w:noProof/>
                 <w:webHidden/>
               </w:rPr>
-              <w:t>15</w:t>
+              <w:t>14</w:t>
             </w:r>
             <w:r>
               <w:rPr>
@@ -2024,7 +1986,7 @@
               <w14:ligatures w14:val="standardContextual"/>
             </w:rPr>
           </w:pPr>
-          <w:hyperlink w:anchor="_Toc239505119" w:history="1">
+          <w:hyperlink w:anchor="_Toc239590101" w:history="1">
             <w:r>
               <w:rPr>
                 <w:rStyle w:val="Hyperlink"/>
@@ -2067,7 +2029,7 @@
                 <w:noProof/>
                 <w:webHidden/>
               </w:rPr>
-              <w:instrText xml:space="preserve"> PAGEREF _Toc239505119 \h </w:instrText>
+              <w:instrText xml:space="preserve"> PAGEREF _Toc239590101 \h </w:instrText>
             </w:r>
             <w:r>
               <w:rPr>
@@ -2087,7 +2049,7 @@
                 <w:noProof/>
                 <w:webHidden/>
               </w:rPr>
-              <w:t>17</w:t>
+              <w:t>16</w:t>
             </w:r>
             <w:r>
               <w:rPr>
@@ -2112,7 +2074,7 @@
               <w14:ligatures w14:val="standardContextual"/>
             </w:rPr>
           </w:pPr>
-          <w:hyperlink w:anchor="_Toc239505120" w:history="1">
+          <w:hyperlink w:anchor="_Toc239590102" w:history="1">
             <w:r>
               <w:rPr>
                 <w:rStyle w:val="Hyperlink"/>
@@ -2171,7 +2133,7 @@
                 <w:noProof/>
                 <w:webHidden/>
               </w:rPr>
-              <w:instrText xml:space="preserve"> PAGEREF _Toc239505120 \h </w:instrText>
+              <w:instrText xml:space="preserve"> PAGEREF _Toc239590102 \h </w:instrText>
             </w:r>
             <w:r>
               <w:rPr>
@@ -2191,7 +2153,7 @@
                 <w:noProof/>
                 <w:webHidden/>
               </w:rPr>
-              <w:t>17</w:t>
+              <w:t>16</w:t>
             </w:r>
             <w:r>
               <w:rPr>
@@ -2216,7 +2178,7 @@
               <w14:ligatures w14:val="standardContextual"/>
             </w:rPr>
           </w:pPr>
-          <w:hyperlink w:anchor="_Toc239505121" w:history="1">
+          <w:hyperlink w:anchor="_Toc239590103" w:history="1">
             <w:r>
               <w:rPr>
                 <w:rStyle w:val="Hyperlink"/>
@@ -2259,7 +2221,7 @@
                 <w:noProof/>
                 <w:webHidden/>
               </w:rPr>
-              <w:instrText xml:space="preserve"> PAGEREF _Toc239505121 \h </w:instrText>
+              <w:instrText xml:space="preserve"> PAGEREF _Toc239590103 \h </w:instrText>
             </w:r>
             <w:r>
               <w:rPr>
@@ -2279,7 +2241,7 @@
                 <w:noProof/>
                 <w:webHidden/>
               </w:rPr>
-              <w:t>17</w:t>
+              <w:t>16</w:t>
             </w:r>
             <w:r>
               <w:rPr>
@@ -2304,7 +2266,7 @@
               <w14:ligatures w14:val="standardContextual"/>
             </w:rPr>
           </w:pPr>
-          <w:hyperlink w:anchor="_Toc239505122" w:history="1">
+          <w:hyperlink w:anchor="_Toc239590104" w:history="1">
             <w:r>
               <w:rPr>
                 <w:rStyle w:val="Hyperlink"/>
@@ -2347,7 +2309,7 @@
                 <w:noProof/>
                 <w:webHidden/>
               </w:rPr>
-              <w:instrText xml:space="preserve"> PAGEREF _Toc239505122 \h </w:instrText>
+              <w:instrText xml:space="preserve"> PAGEREF _Toc239590104 \h </w:instrText>
             </w:r>
             <w:r>
               <w:rPr>
@@ -2367,7 +2329,7 @@
                 <w:noProof/>
                 <w:webHidden/>
               </w:rPr>
-              <w:t>18</w:t>
+              <w:t>17</w:t>
             </w:r>
             <w:r>
               <w:rPr>
@@ -2392,7 +2354,7 @@
               <w14:ligatures w14:val="standardContextual"/>
             </w:rPr>
           </w:pPr>
-          <w:hyperlink w:anchor="_Toc239505123" w:history="1">
+          <w:hyperlink w:anchor="_Toc239590105" w:history="1">
             <w:r>
               <w:rPr>
                 <w:rStyle w:val="Hyperlink"/>
@@ -2435,7 +2397,7 @@
                 <w:noProof/>
                 <w:webHidden/>
               </w:rPr>
-              <w:instrText xml:space="preserve"> PAGEREF _Toc239505123 \h </w:instrText>
+              <w:instrText xml:space="preserve"> PAGEREF _Toc239590105 \h </w:instrText>
             </w:r>
             <w:r>
               <w:rPr>
@@ -2455,7 +2417,7 @@
                 <w:noProof/>
                 <w:webHidden/>
               </w:rPr>
-              <w:t>19</w:t>
+              <w:t>18</w:t>
             </w:r>
             <w:r>
               <w:rPr>
@@ -2480,7 +2442,7 @@
               <w14:ligatures w14:val="standardContextual"/>
             </w:rPr>
           </w:pPr>
-          <w:hyperlink w:anchor="_Toc239505124" w:history="1">
+          <w:hyperlink w:anchor="_Toc239590106" w:history="1">
             <w:r>
               <w:rPr>
                 <w:rStyle w:val="Hyperlink"/>
@@ -2531,7 +2493,7 @@
                 <w:noProof/>
                 <w:webHidden/>
               </w:rPr>
-              <w:instrText xml:space="preserve"> PAGEREF _Toc239505124 \h </w:instrText>
+              <w:instrText xml:space="preserve"> PAGEREF _Toc239590106 \h </w:instrText>
             </w:r>
             <w:r>
               <w:rPr>
@@ -2551,7 +2513,7 @@
                 <w:noProof/>
                 <w:webHidden/>
               </w:rPr>
-              <w:t>23</w:t>
+              <w:t>22</w:t>
             </w:r>
             <w:r>
               <w:rPr>
@@ -2576,7 +2538,7 @@
               <w14:ligatures w14:val="standardContextual"/>
             </w:rPr>
           </w:pPr>
-          <w:hyperlink w:anchor="_Toc239505125" w:history="1">
+          <w:hyperlink w:anchor="_Toc239590107" w:history="1">
             <w:r>
               <w:rPr>
                 <w:rStyle w:val="Hyperlink"/>
@@ -2619,7 +2581,7 @@
                 <w:noProof/>
                 <w:webHidden/>
               </w:rPr>
-              <w:instrText xml:space="preserve"> PAGEREF _Toc239505125 \h </w:instrText>
+              <w:instrText xml:space="preserve"> PAGEREF _Toc239590107 \h </w:instrText>
             </w:r>
             <w:r>
               <w:rPr>
@@ -2639,7 +2601,7 @@
                 <w:noProof/>
                 <w:webHidden/>
               </w:rPr>
-              <w:t>25</w:t>
+              <w:t>24</w:t>
             </w:r>
             <w:r>
               <w:rPr>
@@ -2664,7 +2626,7 @@
               <w14:ligatures w14:val="standardContextual"/>
             </w:rPr>
           </w:pPr>
-          <w:hyperlink w:anchor="_Toc239505126" w:history="1">
+          <w:hyperlink w:anchor="_Toc239590108" w:history="1">
             <w:r>
               <w:rPr>
                 <w:rStyle w:val="Hyperlink"/>
@@ -2691,7 +2653,7 @@
                 <w:noProof/>
                 <w:webHidden/>
               </w:rPr>
-              <w:instrText xml:space="preserve"> PAGEREF _Toc239505126 \h </w:instrText>
+              <w:instrText xml:space="preserve"> PAGEREF _Toc239590108 \h </w:instrText>
             </w:r>
             <w:r>
               <w:rPr>
@@ -2711,7 +2673,7 @@
                 <w:noProof/>
                 <w:webHidden/>
               </w:rPr>
-              <w:t>26</w:t>
+              <w:t>25</w:t>
             </w:r>
             <w:r>
               <w:rPr>
@@ -2736,7 +2698,7 @@
               <w14:ligatures w14:val="standardContextual"/>
             </w:rPr>
           </w:pPr>
-          <w:hyperlink w:anchor="_Toc239505127" w:history="1">
+          <w:hyperlink w:anchor="_Toc239590109" w:history="1">
             <w:r>
               <w:rPr>
                 <w:rStyle w:val="Hyperlink"/>
@@ -2763,7 +2725,7 @@
                 <w:noProof/>
                 <w:webHidden/>
               </w:rPr>
-              <w:instrText xml:space="preserve"> PAGEREF _Toc239505127 \h </w:instrText>
+              <w:instrText xml:space="preserve"> PAGEREF _Toc239590109 \h </w:instrText>
             </w:r>
             <w:r>
               <w:rPr>
@@ -2783,7 +2745,7 @@
                 <w:noProof/>
                 <w:webHidden/>
               </w:rPr>
-              <w:t>26</w:t>
+              <w:t>25</w:t>
             </w:r>
             <w:r>
               <w:rPr>
@@ -2808,7 +2770,7 @@
               <w14:ligatures w14:val="standardContextual"/>
             </w:rPr>
           </w:pPr>
-          <w:hyperlink w:anchor="_Toc239505128" w:history="1">
+          <w:hyperlink w:anchor="_Toc239590110" w:history="1">
             <w:r>
               <w:rPr>
                 <w:rStyle w:val="Hyperlink"/>
@@ -2835,7 +2797,7 @@
                 <w:noProof/>
                 <w:webHidden/>
               </w:rPr>
-              <w:instrText xml:space="preserve"> PAGEREF _Toc239505128 \h </w:instrText>
+              <w:instrText xml:space="preserve"> PAGEREF _Toc239590110 \h </w:instrText>
             </w:r>
             <w:r>
               <w:rPr>
@@ -2855,7 +2817,7 @@
                 <w:noProof/>
                 <w:webHidden/>
               </w:rPr>
-              <w:t>26</w:t>
+              <w:t>25</w:t>
             </w:r>
             <w:r>
               <w:rPr>
@@ -2880,7 +2842,7 @@
               <w14:ligatures w14:val="standardContextual"/>
             </w:rPr>
           </w:pPr>
-          <w:hyperlink w:anchor="_Toc239505129" w:history="1">
+          <w:hyperlink w:anchor="_Toc239590111" w:history="1">
             <w:r>
               <w:rPr>
                 <w:rStyle w:val="Hyperlink"/>
@@ -2907,7 +2869,7 @@
                 <w:noProof/>
                 <w:webHidden/>
               </w:rPr>
-              <w:instrText xml:space="preserve"> PAGEREF _Toc239505129 \h </w:instrText>
+              <w:instrText xml:space="preserve"> PAGEREF _Toc239590111 \h </w:instrText>
             </w:r>
             <w:r>
               <w:rPr>
@@ -2927,7 +2889,7 @@
                 <w:noProof/>
                 <w:webHidden/>
               </w:rPr>
-              <w:t>27</w:t>
+              <w:t>26</w:t>
             </w:r>
             <w:r>
               <w:rPr>
@@ -2952,7 +2914,7 @@
               <w14:ligatures w14:val="standardContextual"/>
             </w:rPr>
           </w:pPr>
-          <w:hyperlink w:anchor="_Toc239505130" w:history="1">
+          <w:hyperlink w:anchor="_Toc239590112" w:history="1">
             <w:r>
               <w:rPr>
                 <w:rStyle w:val="Hyperlink"/>
@@ -2979,7 +2941,7 @@
                 <w:noProof/>
                 <w:webHidden/>
               </w:rPr>
-              <w:instrText xml:space="preserve"> PAGEREF _Toc239505130 \h </w:instrText>
+              <w:instrText xml:space="preserve"> PAGEREF _Toc239590112 \h </w:instrText>
             </w:r>
             <w:r>
               <w:rPr>
@@ -2999,7 +2961,7 @@
                 <w:noProof/>
                 <w:webHidden/>
               </w:rPr>
-              <w:t>35</w:t>
+              <w:t>34</w:t>
             </w:r>
             <w:r>
               <w:rPr>
@@ -3024,7 +2986,7 @@
               <w14:ligatures w14:val="standardContextual"/>
             </w:rPr>
           </w:pPr>
-          <w:hyperlink w:anchor="_Toc239505131" w:history="1">
+          <w:hyperlink w:anchor="_Toc239590113" w:history="1">
             <w:r>
               <w:rPr>
                 <w:rStyle w:val="Hyperlink"/>
@@ -3051,7 +3013,7 @@
                 <w:noProof/>
                 <w:webHidden/>
               </w:rPr>
-              <w:instrText xml:space="preserve"> PAGEREF _Toc239505131 \h </w:instrText>
+              <w:instrText xml:space="preserve"> PAGEREF _Toc239590113 \h </w:instrText>
             </w:r>
             <w:r>
               <w:rPr>
@@ -3071,7 +3033,7 @@
                 <w:noProof/>
                 <w:webHidden/>
               </w:rPr>
-              <w:t>36</w:t>
+              <w:t>35</w:t>
             </w:r>
             <w:r>
               <w:rPr>
@@ -3113,7 +3075,7 @@
           <w:lang w:val="en-US"/>
         </w:rPr>
       </w:pPr>
-      <w:bookmarkStart w:id="1" w:name="_Toc239505103"/>
+      <w:bookmarkStart w:id="1" w:name="_Toc239590082"/>
       <w:r>
         <w:rPr>
           <w:b/>
@@ -3124,16 +3086,18 @@
           <w:szCs w:val="40"/>
           <w:lang w:val="en-US"/>
         </w:rPr>
-        <w:t>1. П</w:t>
-      </w:r>
-      <w:r>
-        <w:rPr>
-          <w:b/>
-          <w:bCs/>
-          <w:color w:val="0F1115"/>
-          <w:kern w:val="36"/>
-          <w:sz w:val="40"/>
-          <w:szCs w:val="40"/>
+        <w:t xml:space="preserve">1. </w:t>
+      </w:r>
+      <w:r>
+        <w:rPr>
+          <w:rStyle w:val="Heading1Char"/>
+          <w:lang w:val="en-US"/>
+        </w:rPr>
+        <w:t>П</w:t>
+      </w:r>
+      <w:r>
+        <w:rPr>
+          <w:rStyle w:val="Heading1Char"/>
           <w:lang w:val="sr-Cyrl-RS"/>
         </w:rPr>
         <w:t>риказ проблема и теме</w:t>
@@ -3321,7 +3285,7 @@
         <w:pStyle w:val="Heading2"/>
         <w:jc w:val="both"/>
       </w:pPr>
-      <w:bookmarkStart w:id="2" w:name="_Toc239505104"/>
+      <w:bookmarkStart w:id="2" w:name="_Toc239590083"/>
       <w:r>
         <w:t>1.1. Категорије политичких ставова у скупу података</w:t>
       </w:r>
@@ -3546,7 +3510,7 @@
           <w:sz w:val="32"/>
         </w:rPr>
       </w:pPr>
-      <w:bookmarkStart w:id="3" w:name="_Toc239505105"/>
+      <w:bookmarkStart w:id="3" w:name="_Toc239590084"/>
       <w:r>
         <w:rPr>
           <w:sz w:val="32"/>
@@ -3639,7 +3603,7 @@
           <w:lang w:val="sr-Cyrl-RS"/>
         </w:rPr>
       </w:pPr>
-      <w:bookmarkStart w:id="4" w:name="_Toc239505106"/>
+      <w:bookmarkStart w:id="4" w:name="_Toc239590085"/>
       <w:r>
         <w:rPr>
           <w:color w:val="0F1115"/>
@@ -3727,7 +3691,7 @@
         <w:pStyle w:val="Heading2"/>
         <w:jc w:val="both"/>
       </w:pPr>
-      <w:bookmarkStart w:id="5" w:name="_Toc239505107"/>
+      <w:bookmarkStart w:id="5" w:name="_Toc239590086"/>
       <w:r>
         <w:t xml:space="preserve">2.1. Прикупљање </w:t>
       </w:r>
@@ -4137,7 +4101,7 @@
                     </pic:cNvPicPr>
                   </pic:nvPicPr>
                   <pic:blipFill rotWithShape="1">
-                    <a:blip r:embed="rId7" cstate="print"/>
+                    <a:blip r:embed="rId9" cstate="print"/>
                     <a:srcRect l="2370" t="1958"/>
                     <a:stretch>
                       <a:fillRect/>
@@ -4329,7 +4293,7 @@
           <w:lang w:val="sr-Cyrl-RS"/>
         </w:rPr>
       </w:pPr>
-      <w:bookmarkStart w:id="6" w:name="_Toc239505108"/>
+      <w:bookmarkStart w:id="6" w:name="_Toc239590087"/>
       <w:r>
         <w:rPr>
           <w:color w:val="auto"/>
@@ -4696,7 +4660,7 @@
           <w:lang w:val="en-US"/>
         </w:rPr>
       </w:pPr>
-      <w:bookmarkStart w:id="7" w:name="_Toc239505109"/>
+      <w:bookmarkStart w:id="7" w:name="_Toc239590088"/>
       <w:r>
         <w:rPr>
           <w:color w:val="auto"/>
@@ -4718,16 +4682,22 @@
       </w:r>
       <w:r>
         <w:rPr>
+          <w:rFonts w:ascii="Times New Roman" w:hAnsi="Times New Roman" w:cs="Times New Roman"/>
           <w:color w:val="auto"/>
+          <w:sz w:val="32"/>
+          <w:szCs w:val="32"/>
           <w:lang w:val="sr-Cyrl-RS"/>
         </w:rPr>
         <w:t xml:space="preserve">Аутоматизована скрипта за </w:t>
       </w:r>
       <w:r>
         <w:rPr>
+          <w:rFonts w:ascii="Times New Roman" w:hAnsi="Times New Roman" w:cs="Times New Roman"/>
           <w:i/>
           <w:iCs/>
           <w:color w:val="auto"/>
+          <w:sz w:val="32"/>
+          <w:szCs w:val="32"/>
           <w:lang w:val="en-US"/>
         </w:rPr>
         <w:t>YouTube</w:t>
@@ -4912,7 +4882,7 @@
           <w:lang w:val="en-US"/>
         </w:rPr>
       </w:pPr>
-      <w:bookmarkStart w:id="8" w:name="_Toc239505110"/>
+      <w:bookmarkStart w:id="8" w:name="_Toc239590089"/>
       <w:r>
         <w:rPr>
           <w:color w:val="auto"/>
@@ -4941,16 +4911,22 @@
       </w:r>
       <w:r>
         <w:rPr>
+          <w:rFonts w:ascii="Times New Roman" w:hAnsi="Times New Roman" w:cs="Times New Roman"/>
           <w:color w:val="auto"/>
+          <w:sz w:val="32"/>
+          <w:szCs w:val="32"/>
           <w:lang w:val="sr-Cyrl-RS"/>
         </w:rPr>
         <w:t xml:space="preserve">Аутоматизована скрипта за </w:t>
       </w:r>
       <w:r>
         <w:rPr>
+          <w:rFonts w:ascii="Times New Roman" w:hAnsi="Times New Roman" w:cs="Times New Roman"/>
           <w:i/>
           <w:iCs/>
           <w:color w:val="auto"/>
+          <w:sz w:val="32"/>
+          <w:szCs w:val="32"/>
           <w:lang w:val="en-US"/>
         </w:rPr>
         <w:t>Facebook</w:t>
@@ -5147,7 +5123,16 @@
           <w:szCs w:val="30"/>
           <w:lang w:val="en-US"/>
         </w:rPr>
-        <w:t xml:space="preserve"> подразумевано приказује само "Најрелевантније"), затим врши скроловање и кликће на дугмад "Прикажи још коментара" све док не преузме све коментаре. Посебно се обрађују Reels објаве, где је потребно кликнути на дугме за отварање панела са коментарима. Такође, скрипта кликће на сва дугмад "Прикажи више" како би прочитала цео текст дугачких коментара.</w:t>
+        <w:t xml:space="preserve"> подразумевано приказује само "Најрелевантније"), затим врши скроловање и кликће на дугмад "Прикажи још коментара" све док не преузме све коментаре. Посебно се обрађују Reels објаве, где је потребно кликнути на дугме за отварање панела са коментарима. </w:t>
+      </w:r>
+      <w:r>
+        <w:rPr>
+          <w:color w:val="0F1115"/>
+          <w:szCs w:val="30"/>
+          <w:lang w:val="en-US"/>
+        </w:rPr>
+        <w:lastRenderedPageBreak/>
+        <w:t>Такође, скрипта кликће на сва дугмад "Прикажи више" како би прочитала цео текст дугачких коментара.</w:t>
       </w:r>
     </w:p>
     <w:p>
@@ -5166,7 +5151,6 @@
           <w:szCs w:val="30"/>
           <w:lang w:val="en-US"/>
         </w:rPr>
-        <w:lastRenderedPageBreak/>
         <w:t xml:space="preserve">Након прикупљања, коментари се чувају у структуираном формату. Као и на другим платформама, издваја се текстуални садржај, уклањају емотикони и пречишћени текстови се додају у заједнички корпус. Због сложености и потребе за прегледачем, прикупљање са </w:t>
       </w:r>
       <w:r>
@@ -5202,7 +5186,7 @@
       <w:pPr>
         <w:pStyle w:val="Heading2"/>
       </w:pPr>
-      <w:bookmarkStart w:id="9" w:name="_Toc239505111"/>
+      <w:bookmarkStart w:id="9" w:name="_Toc239590090"/>
       <w:r>
         <w:t>2.2. Чишћење и стандардизација корпуса</w:t>
       </w:r>
@@ -5335,7 +5319,7 @@
           <w:sz w:val="32"/>
         </w:rPr>
       </w:pPr>
-      <w:bookmarkStart w:id="10" w:name="_Toc239505112"/>
+      <w:bookmarkStart w:id="10" w:name="_Toc239590091"/>
       <w:r>
         <w:rPr>
           <w:rFonts w:ascii="Times New Roman" w:hAnsi="Times New Roman" w:cs="Times New Roman"/>
@@ -5500,7 +5484,7 @@
           <w:szCs w:val="37"/>
         </w:rPr>
       </w:pPr>
-      <w:bookmarkStart w:id="11" w:name="_Toc239505113"/>
+      <w:bookmarkStart w:id="11" w:name="_Toc239590092"/>
       <w:r>
         <w:rPr>
           <w:rFonts w:ascii="Times New Roman" w:hAnsi="Times New Roman" w:cs="Times New Roman"/>
@@ -5553,7 +5537,15 @@
           <w:color w:val="0F1115"/>
           <w:szCs w:val="30"/>
         </w:rPr>
-        <w:t> који приказује коментаре један по један и омогућава избор класе кликом на дугме. Интерфејс омогућава и исправку очигледних типографских грешака у тексту, аутоматски чува напредак у локалној меморији прегледача како би се анотација могла наставити у више наврата, те омогућава извоз анотираних података.</w:t>
+        <w:t xml:space="preserve"> који приказује коментаре један по један и омогућава избор класе кликом на дугме. Интерфејс омогућава и исправку очигледних типографских грешака у тексту, аутоматски чува напредак у локалној меморији прегледача како би се анотација могла наставити у више наврата, те </w:t>
+      </w:r>
+      <w:r>
+        <w:rPr>
+          <w:color w:val="0F1115"/>
+          <w:szCs w:val="30"/>
+        </w:rPr>
+        <w:lastRenderedPageBreak/>
+        <w:t>омогућава извоз анотираних података.</w:t>
       </w:r>
       <w:r>
         <w:rPr>
@@ -5568,15 +5560,7 @@
           <w:color w:val="0F1115"/>
           <w:szCs w:val="30"/>
         </w:rPr>
-        <w:t xml:space="preserve">Овакав приступ убрзао је процес анотације, смањио </w:t>
-      </w:r>
-      <w:r>
-        <w:rPr>
-          <w:color w:val="0F1115"/>
-          <w:szCs w:val="30"/>
-        </w:rPr>
-        <w:lastRenderedPageBreak/>
-        <w:t xml:space="preserve">могућност </w:t>
+        <w:t xml:space="preserve">Овакав приступ убрзао је процес анотације, смањио могућност </w:t>
       </w:r>
       <w:r>
         <w:rPr>
@@ -5680,7 +5664,7 @@
           <w:lang w:val="en-US"/>
         </w:rPr>
       </w:pPr>
-      <w:bookmarkStart w:id="12" w:name="_Toc239505114"/>
+      <w:bookmarkStart w:id="12" w:name="_Toc239590093"/>
       <w:r>
         <w:rPr>
           <w:rFonts w:ascii="Times New Roman" w:hAnsi="Times New Roman" w:cs="Times New Roman"/>
@@ -5985,7 +5969,7 @@
           <w:szCs w:val="37"/>
         </w:rPr>
       </w:pPr>
-      <w:bookmarkStart w:id="13" w:name="_Toc239505115"/>
+      <w:bookmarkStart w:id="13" w:name="_Toc239590094"/>
       <w:r>
         <w:rPr>
           <w:rFonts w:ascii="Times New Roman" w:hAnsi="Times New Roman" w:cs="Times New Roman"/>
@@ -6061,7 +6045,7 @@
           <w:szCs w:val="30"/>
         </w:rPr>
       </w:pPr>
-      <w:bookmarkStart w:id="14" w:name="_Toc239505116"/>
+      <w:bookmarkStart w:id="14" w:name="_Toc239590095"/>
       <w:r>
         <w:t>2.3. Анотација коментара</w:t>
       </w:r>
@@ -6313,7 +6297,7 @@
           <w:sz w:val="32"/>
         </w:rPr>
       </w:pPr>
-      <w:bookmarkStart w:id="15" w:name="_Toc239505117"/>
+      <w:bookmarkStart w:id="15" w:name="_Toc239590096"/>
       <w:r>
         <w:rPr>
           <w:rFonts w:ascii="Times New Roman" w:hAnsi="Times New Roman" w:cs="Times New Roman"/>
@@ -6789,23 +6773,39 @@
       <w:pPr>
         <w:jc w:val="center"/>
         <w:rPr>
-          <w:lang w:val="sr-Cyrl-RS"/>
-        </w:rPr>
-      </w:pPr>
-      <w:r>
-        <w:rPr>
-          <w:lang w:val="sr-Cyrl-RS"/>
-        </w:rPr>
-        <w:t>Табела 2.3.1 — Парно слагање и Cohen</w:t>
-      </w:r>
-      <w:r>
-        <w:rPr>
+          <w:i/>
+          <w:iCs/>
+          <w:sz w:val="22"/>
+          <w:szCs w:val="22"/>
+          <w:lang w:val="sr-Cyrl-RS"/>
+        </w:rPr>
+      </w:pPr>
+      <w:r>
+        <w:rPr>
+          <w:i/>
+          <w:iCs/>
+          <w:sz w:val="22"/>
+          <w:szCs w:val="22"/>
+          <w:lang w:val="sr-Cyrl-RS"/>
+        </w:rPr>
+        <w:t>Табела 2.1 — Парно слагање и Cohen</w:t>
+      </w:r>
+      <w:r>
+        <w:rPr>
+          <w:i/>
+          <w:iCs/>
+          <w:sz w:val="22"/>
+          <w:szCs w:val="22"/>
           <w:lang w:val="en-US"/>
         </w:rPr>
         <w:t>-</w:t>
       </w:r>
       <w:r>
         <w:rPr>
+          <w:i/>
+          <w:iCs/>
+          <w:sz w:val="22"/>
+          <w:szCs w:val="22"/>
           <w:lang w:val="sr-Cyrl-RS"/>
         </w:rPr>
         <w:t>ова κ по пару анотатора (N=250)</w:t>
@@ -7339,11 +7339,11 @@
           <w:szCs w:val="30"/>
         </w:rPr>
       </w:pPr>
-      <w:bookmarkStart w:id="16" w:name="_2.4._Експлоративна_анализа"/>
+      <w:bookmarkStart w:id="16" w:name="_Toc239590097"/>
+      <w:r>
+        <w:t>2.4. Експлоративна анализа података</w:t>
+      </w:r>
       <w:bookmarkEnd w:id="16"/>
-      <w:r>
-        <w:t>2.4. Експлоративна анализа података</w:t>
-      </w:r>
     </w:p>
     <w:p>
       <w:pPr>
@@ -7454,7 +7454,7 @@
                     </pic:cNvPicPr>
                   </pic:nvPicPr>
                   <pic:blipFill>
-                    <a:blip r:embed="rId8" cstate="print"/>
+                    <a:blip r:embed="rId10" cstate="print"/>
                     <a:srcRect t="15042" b="11699"/>
                     <a:stretch>
                       <a:fillRect/>
@@ -7651,7 +7651,7 @@
                     </pic:cNvPicPr>
                   </pic:nvPicPr>
                   <pic:blipFill>
-                    <a:blip r:embed="rId9" cstate="print"/>
+                    <a:blip r:embed="rId11" cstate="print"/>
                     <a:srcRect/>
                     <a:stretch>
                       <a:fillRect/>
@@ -7740,7 +7740,24 @@
           <w:szCs w:val="30"/>
           <w:shd w:val="clear" w:color="auto" w:fill="FFFFFF"/>
         </w:rPr>
-        <w:t>Један од кључних изазова при формирању скупа података за обележавање представљало је обезбеђивање довољне заступљености свих класа, посебно неутралних коментара. Наиме, прелиминарном анализом сирових коментара уочено је да су ставови према власти и протестима често изражени на поларизован начин, док су коментари без јасног става знатно ређи у односу на оне који експлицитно подржавају или критикују власт. Ова природна неравнотежа последица је саме природе јавног дискурса на друштвеним мрежама – корисници се чешће опредељују и изражавају своје мишљење, док су чисто информативни коментари који не заузимају став мање заступљени.</w:t>
+        <w:t>Један од кључних изазова при формирању скупа података за обележавање представљало је обезбеђивање довољне заступљености свих класа, посебно неутралних коментара. Наиме, прелиминарном анализом сирових коментара уочено је да су ставови према власти и протестима често изражени на поларизован начин, док су коментари без јасног става знатно ређи у односу на оне који експлицитно подржавају или критикују власт. Ова природна неравнотежа последица је саме природе јавног дискурса на друштвеним мрежама</w:t>
+      </w:r>
+      <w:r>
+        <w:rPr>
+          <w:color w:val="0F1115"/>
+          <w:szCs w:val="30"/>
+          <w:shd w:val="clear" w:color="auto" w:fill="FFFFFF"/>
+          <w:lang w:val="sr-Cyrl-RS"/>
+        </w:rPr>
+        <w:t xml:space="preserve">, </w:t>
+      </w:r>
+      <w:r>
+        <w:rPr>
+          <w:color w:val="0F1115"/>
+          <w:szCs w:val="30"/>
+          <w:shd w:val="clear" w:color="auto" w:fill="FFFFFF"/>
+        </w:rPr>
+        <w:t>корисници се чешће опредељују и изражавају своје мишљење, док су чисто информативни коментари који не заузимају став мање заступљени.</w:t>
       </w:r>
     </w:p>
     <w:p>
@@ -7830,7 +7847,41 @@
           <w:szCs w:val="30"/>
           <w:shd w:val="clear" w:color="auto" w:fill="FFFFFF"/>
         </w:rPr>
-        <w:t>Упркос овим напорима, неутрални коментари и даље чине 23,2% укупног анотираног скупа, док PROTIV-VLASTI чине 40,6%, а ZA-VLAST 36,1%. Оваква расподела очекивана је с обзиром на природу друштвено-политичког дискурса – изражавање става је чешће од уздржавања. Ипак</w:t>
+        <w:t>Упркос овим напорима, неутрални коментари и даље чине 23,2% укупног анотираног скупа, док PROTIV-VLASTI чине 40,6%, а ZA-VLAST 36,1%. Оваква расподела очекивана је с обзиром на природу друштвено-политичког дискурса</w:t>
+      </w:r>
+      <w:r>
+        <w:rPr>
+          <w:color w:val="0F1115"/>
+          <w:szCs w:val="30"/>
+          <w:shd w:val="clear" w:color="auto" w:fill="FFFFFF"/>
+          <w:lang w:val="sr-Cyrl-RS"/>
+        </w:rPr>
+        <w:t>.</w:t>
+      </w:r>
+      <w:r>
+        <w:rPr>
+          <w:color w:val="0F1115"/>
+          <w:szCs w:val="30"/>
+          <w:shd w:val="clear" w:color="auto" w:fill="FFFFFF"/>
+        </w:rPr>
+        <w:t xml:space="preserve"> </w:t>
+      </w:r>
+      <w:r>
+        <w:rPr>
+          <w:color w:val="0F1115"/>
+          <w:szCs w:val="30"/>
+          <w:shd w:val="clear" w:color="auto" w:fill="FFFFFF"/>
+          <w:lang w:val="sr-Cyrl-RS"/>
+        </w:rPr>
+        <w:t>И</w:t>
+      </w:r>
+      <w:r>
+        <w:rPr>
+          <w:color w:val="0F1115"/>
+          <w:szCs w:val="30"/>
+          <w:shd w:val="clear" w:color="auto" w:fill="FFFFFF"/>
+        </w:rPr>
+        <w:t>зражавање става је чешће од уздржавања. Ипак</w:t>
       </w:r>
       <w:r>
         <w:rPr>
@@ -7912,8 +7963,7 @@
           <w:sz w:val="32"/>
         </w:rPr>
       </w:pPr>
-      <w:bookmarkStart w:id="17" w:name="_2.4.1._Расподела_по"/>
-      <w:bookmarkEnd w:id="17"/>
+      <w:bookmarkStart w:id="17" w:name="_Toc239590098"/>
       <w:r>
         <w:rPr>
           <w:rFonts w:ascii="Times New Roman" w:hAnsi="Times New Roman" w:cs="Times New Roman"/>
@@ -7923,6 +7973,7 @@
         <w:lastRenderedPageBreak/>
         <w:t>2.4.1. Расподела по платформама</w:t>
       </w:r>
+      <w:bookmarkEnd w:id="17"/>
     </w:p>
     <w:p>
       <w:pPr>
@@ -8008,7 +8059,7 @@
                     </pic:cNvPicPr>
                   </pic:nvPicPr>
                   <pic:blipFill>
-                    <a:blip r:embed="rId10" cstate="print">
+                    <a:blip r:embed="rId12" cstate="print">
                       <a:extLst>
                         <a:ext uri="{28A0092B-C50C-407E-A947-70E740481C1C}">
                           <a14:useLocalDpi xmlns:a14="http://schemas.microsoft.com/office/drawing/2010/main" val="0"/>
@@ -8105,7 +8156,7 @@
                     </pic:cNvPicPr>
                   </pic:nvPicPr>
                   <pic:blipFill rotWithShape="1">
-                    <a:blip r:embed="rId11" cstate="print"/>
+                    <a:blip r:embed="rId13" cstate="print"/>
                     <a:srcRect t="8494"/>
                     <a:stretch>
                       <a:fillRect/>
@@ -8335,8 +8386,7 @@
           <w:sz w:val="32"/>
         </w:rPr>
       </w:pPr>
-      <w:bookmarkStart w:id="18" w:name="_2.4.2._Дужина_коментара"/>
-      <w:bookmarkEnd w:id="18"/>
+      <w:bookmarkStart w:id="18" w:name="_Toc239590099"/>
       <w:r>
         <w:rPr>
           <w:rFonts w:ascii="Times New Roman" w:hAnsi="Times New Roman" w:cs="Times New Roman"/>
@@ -8345,6 +8395,7 @@
         </w:rPr>
         <w:t>2.4.2. Дужина коментара</w:t>
       </w:r>
+      <w:bookmarkEnd w:id="18"/>
     </w:p>
     <w:p>
       <w:pPr>
@@ -8397,18 +8448,45 @@
         <w:ind w:firstLine="720"/>
         <w:jc w:val="both"/>
         <w:rPr>
-          <w:color w:val="0F1115"/>
-          <w:szCs w:val="30"/>
-          <w:lang w:val="sr-Cyrl-RS"/>
-        </w:rPr>
-      </w:pPr>
-      <w:r>
-        <w:rPr>
-          <w:color w:val="0F1115"/>
-          <w:szCs w:val="30"/>
-          <w:lang w:val="sr-Cyrl-RS"/>
-        </w:rPr>
-        <w:t>Табела 2.1 – Статистика дужине коментара</w:t>
+          <w:i/>
+          <w:iCs/>
+          <w:color w:val="0F1115"/>
+          <w:sz w:val="22"/>
+          <w:szCs w:val="22"/>
+          <w:lang w:val="sr-Cyrl-RS"/>
+        </w:rPr>
+      </w:pPr>
+      <w:r>
+        <w:rPr>
+          <w:i/>
+          <w:iCs/>
+          <w:color w:val="0F1115"/>
+          <w:sz w:val="22"/>
+          <w:szCs w:val="22"/>
+          <w:lang w:val="sr-Cyrl-RS"/>
+        </w:rPr>
+        <w:t>Табела 2.</w:t>
+      </w:r>
+      <w:r>
+        <w:rPr>
+          <w:i/>
+          <w:iCs/>
+          <w:color w:val="0F1115"/>
+          <w:sz w:val="22"/>
+          <w:szCs w:val="22"/>
+        </w:rPr>
+        <w:t>2</w:t>
+      </w:r>
+      <w:r>
+        <w:rPr>
+          <w:i/>
+          <w:iCs/>
+          <w:color w:val="0F1115"/>
+          <w:sz w:val="22"/>
+          <w:szCs w:val="22"/>
+          <w:lang w:val="sr-Cyrl-RS"/>
+        </w:rPr>
+        <w:t xml:space="preserve"> – Статистика дужине коментара</w:t>
       </w:r>
     </w:p>
     <w:tbl>
@@ -9206,7 +9284,7 @@
                     </pic:cNvPicPr>
                   </pic:nvPicPr>
                   <pic:blipFill rotWithShape="1">
-                    <a:blip r:embed="rId12" cstate="print"/>
+                    <a:blip r:embed="rId14" cstate="print"/>
                     <a:srcRect t="8912"/>
                     <a:stretch>
                       <a:fillRect/>
@@ -9313,7 +9391,7 @@
                     </pic:cNvPicPr>
                   </pic:nvPicPr>
                   <pic:blipFill rotWithShape="1">
-                    <a:blip r:embed="rId13" cstate="print"/>
+                    <a:blip r:embed="rId15" cstate="print"/>
                     <a:srcRect t="11474"/>
                     <a:stretch>
                       <a:fillRect/>
@@ -9454,7 +9532,7 @@
           <w:szCs w:val="37"/>
         </w:rPr>
       </w:pPr>
-      <w:bookmarkStart w:id="19" w:name="_Toc239505118"/>
+      <w:bookmarkStart w:id="19" w:name="_Toc239590100"/>
       <w:r>
         <w:rPr>
           <w:rFonts w:ascii="Times New Roman" w:hAnsi="Times New Roman" w:cs="Times New Roman"/>
@@ -9574,14 +9652,21 @@
           <w:rStyle w:val="Emphasis"/>
           <w:lang w:val="sr-Cyrl-RS"/>
         </w:rPr>
-        <w:t xml:space="preserve">студенти, сви, народ, снс </w:t>
-      </w:r>
-      <w:r>
-        <w:rPr>
-          <w:color w:val="0F1115"/>
-          <w:szCs w:val="30"/>
-        </w:rPr>
-        <w:t>— што говори о критичком тону и захтевима за променама.</w:t>
+        <w:t>студенти, сви, народ, снс</w:t>
+      </w:r>
+      <w:r>
+        <w:rPr>
+          <w:rStyle w:val="Emphasis"/>
+          <w:lang w:val="sr-Cyrl-RS"/>
+        </w:rPr>
+        <w:t>,</w:t>
+      </w:r>
+      <w:r>
+        <w:rPr>
+          <w:color w:val="0F1115"/>
+          <w:szCs w:val="30"/>
+        </w:rPr>
+        <w:t xml:space="preserve"> што говори о критичком тону и захтевима за променама.</w:t>
       </w:r>
     </w:p>
     <w:p>
@@ -9619,7 +9704,7 @@
                     </pic:cNvPicPr>
                   </pic:nvPicPr>
                   <pic:blipFill>
-                    <a:blip r:embed="rId14" cstate="print"/>
+                    <a:blip r:embed="rId16" cstate="print"/>
                     <a:srcRect/>
                     <a:stretch>
                       <a:fillRect/>
@@ -9979,7 +10064,7 @@
           <w:szCs w:val="45"/>
         </w:rPr>
       </w:pPr>
-      <w:bookmarkStart w:id="20" w:name="_Toc239505119"/>
+      <w:bookmarkStart w:id="20" w:name="_Toc239590101"/>
       <w:r>
         <w:rPr>
           <w:color w:val="0F1115"/>
@@ -10097,7 +10182,7 @@
           <w:lang w:val="sr-Cyrl-RS"/>
         </w:rPr>
       </w:pPr>
-      <w:bookmarkStart w:id="21" w:name="_Toc239505120"/>
+      <w:bookmarkStart w:id="21" w:name="_Toc239590102"/>
       <w:r>
         <w:rPr>
           <w:lang w:val="sr-Cyrl-RS"/>
@@ -10396,7 +10481,7 @@
           <w:lang w:val="sr-Cyrl-RS"/>
         </w:rPr>
       </w:pPr>
-      <w:bookmarkStart w:id="22" w:name="_Toc239505121"/>
+      <w:bookmarkStart w:id="22" w:name="_Toc239590103"/>
       <w:r>
         <w:rPr>
           <w:rFonts w:ascii="Times New Roman" w:hAnsi="Times New Roman" w:cs="Times New Roman"/>
@@ -10864,7 +10949,7 @@
           <w:lang w:val="sr-Cyrl-RS"/>
         </w:rPr>
       </w:pPr>
-      <w:bookmarkStart w:id="23" w:name="_Toc239505122"/>
+      <w:bookmarkStart w:id="23" w:name="_Toc239590104"/>
       <w:r>
         <w:rPr>
           <w:rFonts w:ascii="Times New Roman" w:hAnsi="Times New Roman" w:cs="Times New Roman"/>
@@ -11150,7 +11235,7 @@
           <w:lang w:val="sr-Cyrl-RS"/>
         </w:rPr>
       </w:pPr>
-      <w:bookmarkStart w:id="24" w:name="_Toc239505123"/>
+      <w:bookmarkStart w:id="24" w:name="_Toc239590105"/>
       <w:r>
         <w:rPr>
           <w:rFonts w:ascii="Times New Roman" w:hAnsi="Times New Roman" w:cs="Times New Roman"/>
@@ -11303,31 +11388,39 @@
       <w:pPr>
         <w:jc w:val="center"/>
         <w:rPr>
-          <w:lang w:val="sr-Cyrl-RS"/>
-        </w:rPr>
-      </w:pPr>
-      <w:r>
-        <w:rPr>
-          <w:lang w:val="sr-Cyrl-RS"/>
-        </w:rPr>
-        <w:t xml:space="preserve">Табела 3.1 Резултати најбоље </w:t>
-      </w:r>
-      <w:r>
-        <w:rPr>
           <w:i/>
           <w:iCs/>
-          <w:lang w:val="en-US"/>
-        </w:rPr>
-        <w:t>baseline</w:t>
-      </w:r>
-      <w:r>
-        <w:rPr>
-          <w:lang w:val="en-US"/>
-        </w:rPr>
-        <w:t xml:space="preserve"> </w:t>
-      </w:r>
-      <w:r>
-        <w:rPr>
+          <w:sz w:val="22"/>
+          <w:szCs w:val="22"/>
+          <w:lang w:val="sr-Cyrl-RS"/>
+        </w:rPr>
+      </w:pPr>
+      <w:r>
+        <w:rPr>
+          <w:i/>
+          <w:iCs/>
+          <w:sz w:val="22"/>
+          <w:szCs w:val="22"/>
+          <w:lang w:val="sr-Cyrl-RS"/>
+        </w:rPr>
+        <w:t xml:space="preserve">Табела 3.1 Резултати најбоље </w:t>
+      </w:r>
+      <w:r>
+        <w:rPr>
+          <w:i/>
+          <w:iCs/>
+          <w:sz w:val="22"/>
+          <w:szCs w:val="22"/>
+          <w:lang w:val="en-US"/>
+        </w:rPr>
+        <w:t xml:space="preserve">baseline </w:t>
+      </w:r>
+      <w:r>
+        <w:rPr>
+          <w:i/>
+          <w:iCs/>
+          <w:sz w:val="22"/>
+          <w:szCs w:val="22"/>
           <w:lang w:val="sr-Cyrl-RS"/>
         </w:rPr>
         <w:t>конфигурације по класи</w:t>
@@ -11735,7 +11828,7 @@
           <w:noProof/>
         </w:rPr>
         <w:drawing>
-          <wp:inline distT="0" distB="0" distL="0" distR="0" wp14:anchorId="1313D8FD" wp14:editId="68EDC7A4">
+          <wp:inline distT="0" distB="0" distL="0" distR="0" wp14:anchorId="1313D8FD" wp14:editId="7DB705BC">
             <wp:extent cx="5943600" cy="3328035"/>
             <wp:effectExtent l="0" t="0" r="0" b="0"/>
             <wp:docPr id="898205917" name="Picture 1"/>
@@ -11752,7 +11845,7 @@
                     </pic:cNvPicPr>
                   </pic:nvPicPr>
                   <pic:blipFill>
-                    <a:blip r:embed="rId15" cstate="print">
+                    <a:blip r:embed="rId17" cstate="print">
                       <a:extLst>
                         <a:ext uri="{28A0092B-C50C-407E-A947-70E740481C1C}">
                           <a14:useLocalDpi xmlns:a14="http://schemas.microsoft.com/office/drawing/2010/main" val="0"/>
@@ -11946,7 +12039,7 @@
                     </pic:cNvPicPr>
                   </pic:nvPicPr>
                   <pic:blipFill>
-                    <a:blip r:embed="rId16">
+                    <a:blip r:embed="rId18">
                       <a:extLst>
                         <a:ext uri="{28A0092B-C50C-407E-A947-70E740481C1C}">
                           <a14:useLocalDpi xmlns:a14="http://schemas.microsoft.com/office/drawing/2010/main" val="0"/>
@@ -12045,7 +12138,7 @@
           <w:noProof/>
         </w:rPr>
         <w:drawing>
-          <wp:inline distT="0" distB="0" distL="0" distR="0" wp14:anchorId="2C920BA3" wp14:editId="3E5BF5B4">
+          <wp:inline distT="0" distB="0" distL="0" distR="0" wp14:anchorId="2C920BA3" wp14:editId="500F803A">
             <wp:extent cx="3987800" cy="2866869"/>
             <wp:effectExtent l="0" t="0" r="0" b="0"/>
             <wp:docPr id="509868485" name="Picture 4"/>
@@ -12062,7 +12155,7 @@
                     </pic:cNvPicPr>
                   </pic:nvPicPr>
                   <pic:blipFill>
-                    <a:blip r:embed="rId17" cstate="print">
+                    <a:blip r:embed="rId19" cstate="print">
                       <a:extLst>
                         <a:ext uri="{28A0092B-C50C-407E-A947-70E740481C1C}">
                           <a14:useLocalDpi xmlns:a14="http://schemas.microsoft.com/office/drawing/2010/main" val="0"/>
@@ -12213,7 +12306,7 @@
           <w:noProof/>
         </w:rPr>
         <w:drawing>
-          <wp:inline distT="0" distB="0" distL="0" distR="0" wp14:anchorId="5E890F76" wp14:editId="7C2BFB7D">
+          <wp:inline distT="0" distB="0" distL="0" distR="0" wp14:anchorId="5E890F76" wp14:editId="59BD5916">
             <wp:extent cx="4953000" cy="2626784"/>
             <wp:effectExtent l="0" t="0" r="0" b="0"/>
             <wp:docPr id="1366039043" name="Picture 5"/>
@@ -12230,7 +12323,7 @@
                     </pic:cNvPicPr>
                   </pic:nvPicPr>
                   <pic:blipFill>
-                    <a:blip r:embed="rId18" cstate="print">
+                    <a:blip r:embed="rId20" cstate="print">
                       <a:extLst>
                         <a:ext uri="{28A0092B-C50C-407E-A947-70E740481C1C}">
                           <a14:useLocalDpi xmlns:a14="http://schemas.microsoft.com/office/drawing/2010/main" val="0"/>
@@ -12399,7 +12492,7 @@
           <w:noProof/>
         </w:rPr>
         <w:drawing>
-          <wp:inline distT="0" distB="0" distL="0" distR="0" wp14:anchorId="79D5321F" wp14:editId="1A16194F">
+          <wp:inline distT="0" distB="0" distL="0" distR="0" wp14:anchorId="79D5321F" wp14:editId="7CC98341">
             <wp:extent cx="4336473" cy="3117532"/>
             <wp:effectExtent l="0" t="0" r="0" b="0"/>
             <wp:docPr id="1245236040" name="Picture 3"/>
@@ -12416,7 +12509,7 @@
                     </pic:cNvPicPr>
                   </pic:nvPicPr>
                   <pic:blipFill>
-                    <a:blip r:embed="rId19" cstate="print">
+                    <a:blip r:embed="rId21" cstate="print">
                       <a:extLst>
                         <a:ext uri="{28A0092B-C50C-407E-A947-70E740481C1C}">
                           <a14:useLocalDpi xmlns:a14="http://schemas.microsoft.com/office/drawing/2010/main" val="0"/>
@@ -12487,7 +12580,7 @@
         </w:rPr>
         <w:lastRenderedPageBreak/>
         <w:drawing>
-          <wp:inline distT="0" distB="0" distL="0" distR="0" wp14:anchorId="4E94A1EE" wp14:editId="252D5FA0">
+          <wp:inline distT="0" distB="0" distL="0" distR="0" wp14:anchorId="4E94A1EE" wp14:editId="4D0CBD5D">
             <wp:extent cx="4506686" cy="3239901"/>
             <wp:effectExtent l="0" t="0" r="0" b="0"/>
             <wp:docPr id="171307232" name="Picture 6"/>
@@ -12504,7 +12597,7 @@
                     </pic:cNvPicPr>
                   </pic:nvPicPr>
                   <pic:blipFill>
-                    <a:blip r:embed="rId20" cstate="print">
+                    <a:blip r:embed="rId22" cstate="print">
                       <a:extLst>
                         <a:ext uri="{28A0092B-C50C-407E-A947-70E740481C1C}">
                           <a14:useLocalDpi xmlns:a14="http://schemas.microsoft.com/office/drawing/2010/main" val="0"/>
@@ -12645,7 +12738,7 @@
                     </pic:cNvPicPr>
                   </pic:nvPicPr>
                   <pic:blipFill>
-                    <a:blip r:embed="rId21">
+                    <a:blip r:embed="rId23">
                       <a:extLst>
                         <a:ext uri="{28A0092B-C50C-407E-A947-70E740481C1C}">
                           <a14:useLocalDpi xmlns:a14="http://schemas.microsoft.com/office/drawing/2010/main" val="0"/>
@@ -12761,7 +12854,7 @@
                     </pic:cNvPicPr>
                   </pic:nvPicPr>
                   <pic:blipFill>
-                    <a:blip r:embed="rId22" cstate="print">
+                    <a:blip r:embed="rId24" cstate="print">
                       <a:extLst>
                         <a:ext uri="{28A0092B-C50C-407E-A947-70E740481C1C}">
                           <a14:useLocalDpi xmlns:a14="http://schemas.microsoft.com/office/drawing/2010/main" val="0"/>
@@ -12872,7 +12965,7 @@
           <w:lang w:val="en-US"/>
         </w:rPr>
       </w:pPr>
-      <w:bookmarkStart w:id="25" w:name="_Toc239505124"/>
+      <w:bookmarkStart w:id="25" w:name="_Toc239590106"/>
       <w:r>
         <w:rPr>
           <w:rFonts w:ascii="Times New Roman" w:hAnsi="Times New Roman" w:cs="Times New Roman"/>
@@ -12998,7 +13091,19 @@
         <w:rPr>
           <w:lang w:val="sr-Cyrl-RS"/>
         </w:rPr>
-        <w:t>, кроз три подешавања: без филтрирања (min_df=1, max_df=1.0), тренутно подешавање (min_df=2, max_df=0.95) и строже филтрирање (min_df=5, max_df=0.90). За сваки модел тестирано је по шест конфигурација (три за н-граме, три за филтрирање), при чему тренутно подешавање представља заједничку референтну тачку за оба фактора — његов резултат се стога понавља у оба блока. Укупно 18 нових покретања, без пуног факторијалног укрштања оба фактора (3×3=9 по моделу, 27 укупно) и без понављања целе мреже од 54 базне конфигурације.</w:t>
+        <w:t>, кроз три подешавања: без филтрирања (min_df=1, max_df=1.0), тренутно подешавање (min_df=2, max_df=0.95) и строже филтрирање (min_df=5, max_df=0.90). За сваки модел тестирано је по шест конфигурација (три за н-граме, три за филтрирање), при чему тренутно подешавање представља заједничку референтну тачку за оба фактора</w:t>
+      </w:r>
+      <w:r>
+        <w:rPr>
+          <w:lang w:val="en-US"/>
+        </w:rPr>
+        <w:t xml:space="preserve">, </w:t>
+      </w:r>
+      <w:r>
+        <w:rPr>
+          <w:lang w:val="sr-Cyrl-RS"/>
+        </w:rPr>
+        <w:t>његов резултат се стога понавља у оба блока. Укупно 18 нових покретања, без пуног факторијалног укрштања оба фактора (3×3=9 по моделу, 27 укупно) и без понављања целе мреже од 54 базне конфигурације.</w:t>
       </w:r>
     </w:p>
     <w:p>
@@ -13012,8 +13117,17 @@
     </w:p>
     <w:p>
       <w:pPr>
+        <w:ind w:firstLine="720"/>
         <w:jc w:val="both"/>
         <w:rPr>
+          <w:lang w:val="en-US"/>
+        </w:rPr>
+      </w:pPr>
+    </w:p>
+    <w:p>
+      <w:pPr>
+        <w:jc w:val="both"/>
+        <w:rPr>
           <w:lang w:val="sr-Cyrl-RS"/>
         </w:rPr>
       </w:pPr>
@@ -13022,15 +13136,43 @@
       <w:pPr>
         <w:jc w:val="center"/>
         <w:rPr>
-          <w:lang w:val="en-US"/>
-        </w:rPr>
-      </w:pPr>
-      <w:r>
-        <w:rPr>
+          <w:i/>
+          <w:iCs/>
+          <w:sz w:val="22"/>
+          <w:szCs w:val="22"/>
+          <w:lang w:val="en-US"/>
+        </w:rPr>
+      </w:pPr>
+      <w:r>
+        <w:rPr>
+          <w:i/>
+          <w:iCs/>
+          <w:sz w:val="22"/>
+          <w:szCs w:val="22"/>
           <w:lang w:val="sr-Cyrl-RS"/>
         </w:rPr>
         <w:lastRenderedPageBreak/>
-        <w:t>Табела — Резултати аблације опсега н-грама и филтрирања речника</w:t>
+        <w:t xml:space="preserve">Табела </w:t>
+      </w:r>
+      <w:r>
+        <w:rPr>
+          <w:i/>
+          <w:iCs/>
+          <w:sz w:val="22"/>
+          <w:szCs w:val="22"/>
+          <w:lang w:val="en-US"/>
+        </w:rPr>
+        <w:t xml:space="preserve">3.2 </w:t>
+      </w:r>
+      <w:r>
+        <w:rPr>
+          <w:i/>
+          <w:iCs/>
+          <w:sz w:val="22"/>
+          <w:szCs w:val="22"/>
+          <w:lang w:val="sr-Cyrl-RS"/>
+        </w:rPr>
+        <w:t>Резултати аблације опсега н-грама и филтрирања речника</w:t>
       </w:r>
     </w:p>
     <w:p>
@@ -16359,7 +16501,7 @@
           <w:lang w:val="sr-Cyrl-RS"/>
         </w:rPr>
       </w:pPr>
-      <w:bookmarkStart w:id="26" w:name="_Toc239505125"/>
+      <w:bookmarkStart w:id="26" w:name="_Toc239590107"/>
       <w:r>
         <w:rPr>
           <w:rFonts w:ascii="Times New Roman" w:hAnsi="Times New Roman" w:cs="Times New Roman"/>
@@ -16662,7 +16804,7 @@
         <w:pStyle w:val="Heading1"/>
         <w:spacing w:before="300" w:after="160"/>
       </w:pPr>
-      <w:bookmarkStart w:id="27" w:name="_Toc239505126"/>
+      <w:bookmarkStart w:id="27" w:name="_Toc239590108"/>
       <w:r>
         <w:rPr>
           <w:color w:val="000000"/>
@@ -16761,7 +16903,7 @@
         <w:pStyle w:val="Heading2"/>
         <w:spacing w:before="300" w:after="160"/>
       </w:pPr>
-      <w:bookmarkStart w:id="28" w:name="_Toc239505127"/>
+      <w:bookmarkStart w:id="28" w:name="_Toc239590109"/>
       <w:r>
         <w:rPr>
           <w:color w:val="000000"/>
@@ -16893,7 +17035,7 @@
         <w:pStyle w:val="Heading2"/>
         <w:spacing w:before="300" w:after="160"/>
       </w:pPr>
-      <w:bookmarkStart w:id="29" w:name="_Toc239505128"/>
+      <w:bookmarkStart w:id="29" w:name="_Toc239590110"/>
       <w:r>
         <w:rPr>
           <w:color w:val="000000"/>
@@ -17099,6 +17241,8 @@
         <w:ind w:firstLine="720"/>
         <w:jc w:val="both"/>
         <w:rPr>
+          <w:sz w:val="22"/>
+          <w:szCs w:val="22"/>
           <w:lang w:val="sr-Cyrl-RS"/>
         </w:rPr>
       </w:pPr>
@@ -17107,16 +17251,40 @@
       <w:pPr>
         <w:spacing w:before="80" w:after="240"/>
         <w:jc w:val="center"/>
+        <w:rPr>
+          <w:sz w:val="22"/>
+          <w:szCs w:val="22"/>
+        </w:rPr>
       </w:pPr>
       <w:r>
         <w:rPr>
           <w:i/>
           <w:iCs/>
           <w:color w:val="000000"/>
-          <w:sz w:val="20"/>
-          <w:szCs w:val="20"/>
-        </w:rPr>
-        <w:t>Табела 3.2 Хиперпараметри енкодер модела</w:t>
+          <w:sz w:val="22"/>
+          <w:szCs w:val="22"/>
+        </w:rPr>
+        <w:t>Табела 3.</w:t>
+      </w:r>
+      <w:r>
+        <w:rPr>
+          <w:i/>
+          <w:iCs/>
+          <w:color w:val="000000"/>
+          <w:sz w:val="22"/>
+          <w:szCs w:val="22"/>
+        </w:rPr>
+        <w:t>3</w:t>
+      </w:r>
+      <w:r>
+        <w:rPr>
+          <w:i/>
+          <w:iCs/>
+          <w:color w:val="000000"/>
+          <w:sz w:val="22"/>
+          <w:szCs w:val="22"/>
+        </w:rPr>
+        <w:t xml:space="preserve"> Хиперпараметри енкодер модела</w:t>
       </w:r>
     </w:p>
     <w:tbl>
@@ -17595,7 +17763,7 @@
         <w:pStyle w:val="Heading2"/>
         <w:spacing w:before="300" w:after="160"/>
       </w:pPr>
-      <w:bookmarkStart w:id="30" w:name="_Toc239505129"/>
+      <w:bookmarkStart w:id="30" w:name="_Toc239590111"/>
       <w:r>
         <w:rPr>
           <w:color w:val="000000"/>
@@ -17801,7 +17969,7 @@
                     </pic:cNvPicPr>
                   </pic:nvPicPr>
                   <pic:blipFill>
-                    <a:blip r:embed="rId23"/>
+                    <a:blip r:embed="rId25"/>
                     <a:srcRect/>
                     <a:stretch>
                       <a:fillRect/>
@@ -17900,7 +18068,19 @@
         <w:rPr>
           <w:color w:val="000000"/>
         </w:rPr>
-        <w:t>У Табели 3.3 приказане су прецизност, одзив и F1 по класама за све четири конфигурације. BERT</w:t>
+        <w:t>У Табели 3.</w:t>
+      </w:r>
+      <w:r>
+        <w:rPr>
+          <w:color w:val="000000"/>
+        </w:rPr>
+        <w:t>4</w:t>
+      </w:r>
+      <w:r>
+        <w:rPr>
+          <w:color w:val="000000"/>
+        </w:rPr>
+        <w:t xml:space="preserve"> приказане су прецизност, одзив и F1 по класама за све четири конфигурације. BERT</w:t>
       </w:r>
       <w:r>
         <w:rPr>
@@ -17956,7 +18136,27 @@
           <w:sz w:val="20"/>
           <w:szCs w:val="20"/>
         </w:rPr>
-        <w:t>Табела 3.3 Перформансе енкодер модела по класама (epochs = 5)</w:t>
+        <w:t>Табела 3.</w:t>
+      </w:r>
+      <w:r>
+        <w:rPr>
+          <w:i/>
+          <w:iCs/>
+          <w:color w:val="000000"/>
+          <w:sz w:val="20"/>
+          <w:szCs w:val="20"/>
+        </w:rPr>
+        <w:t>4</w:t>
+      </w:r>
+      <w:r>
+        <w:rPr>
+          <w:i/>
+          <w:iCs/>
+          <w:color w:val="000000"/>
+          <w:sz w:val="20"/>
+          <w:szCs w:val="20"/>
+        </w:rPr>
+        <w:t xml:space="preserve"> Перформансе енкодер модела по класама (epochs = 5)</w:t>
       </w:r>
     </w:p>
     <w:tbl>
@@ -19146,7 +19346,19 @@
           <w:color w:val="000000"/>
         </w:rPr>
         <w:lastRenderedPageBreak/>
-        <w:t>Напомена: вредности у Табели 3.3 израчунате су директно из матрица конфузије на Сликама 3.12–3.15 и у потпуности се слажу са macro-F1 и accuracy вредностима приказаним на Сликама 3.9 и 3.16.</w:t>
+        <w:t>Напомена: вредности у Табели 3.</w:t>
+      </w:r>
+      <w:r>
+        <w:rPr>
+          <w:color w:val="000000"/>
+        </w:rPr>
+        <w:t>4</w:t>
+      </w:r>
+      <w:r>
+        <w:rPr>
+          <w:color w:val="000000"/>
+        </w:rPr>
+        <w:t xml:space="preserve"> израчунате су директно из матрица конфузије на Сликама 3.12–3.15 и у потпуности се слажу са macro-F1 и accuracy вредностима приказаним на Сликама 3.9 и 3.16.</w:t>
       </w:r>
     </w:p>
     <w:p>
@@ -19176,7 +19388,7 @@
                     </pic:cNvPicPr>
                   </pic:nvPicPr>
                   <pic:blipFill>
-                    <a:blip r:embed="rId24"/>
+                    <a:blip r:embed="rId26"/>
                     <a:srcRect/>
                     <a:stretch>
                       <a:fillRect/>
@@ -19360,7 +19572,7 @@
                     </pic:cNvPicPr>
                   </pic:nvPicPr>
                   <pic:blipFill>
-                    <a:blip r:embed="rId25"/>
+                    <a:blip r:embed="rId27"/>
                     <a:srcRect/>
                     <a:stretch>
                       <a:fillRect/>
@@ -19409,7 +19621,19 @@
           <w:color w:val="000000"/>
         </w:rPr>
         <w:lastRenderedPageBreak/>
-        <w:t>Табела 3.4 приказује оквирну расподелу macro-F1 по fold-овима, очитану са Слике 3.11 (тачне вредности mean/std нису доступне из самог графикона, па су наведене медијана, минимум и максимум).</w:t>
+        <w:t>Табела 3.</w:t>
+      </w:r>
+      <w:r>
+        <w:rPr>
+          <w:color w:val="000000"/>
+        </w:rPr>
+        <w:t>5</w:t>
+      </w:r>
+      <w:r>
+        <w:rPr>
+          <w:color w:val="000000"/>
+        </w:rPr>
+        <w:t xml:space="preserve"> приказује оквирну расподелу macro-F1 по fold-овима, очитану са Слике 3.11 (тачне вредности mean/std нису доступне из самог графикона, па су наведене медијана, минимум и максимум).</w:t>
       </w:r>
     </w:p>
     <w:p>
@@ -19425,7 +19649,27 @@
           <w:sz w:val="20"/>
           <w:szCs w:val="20"/>
         </w:rPr>
-        <w:t>Табела 3.4 Оквирна стабилност macro-F1 по 10 fold-ова (очитано са Слике 3.11)</w:t>
+        <w:t>Табела 3.</w:t>
+      </w:r>
+      <w:r>
+        <w:rPr>
+          <w:i/>
+          <w:iCs/>
+          <w:color w:val="000000"/>
+          <w:sz w:val="20"/>
+          <w:szCs w:val="20"/>
+        </w:rPr>
+        <w:t>5</w:t>
+      </w:r>
+      <w:r>
+        <w:rPr>
+          <w:i/>
+          <w:iCs/>
+          <w:color w:val="000000"/>
+          <w:sz w:val="20"/>
+          <w:szCs w:val="20"/>
+        </w:rPr>
+        <w:t xml:space="preserve"> Оквирна стабилност macro-F1 по 10 fold-ова (очитано са Слике 3.11)</w:t>
       </w:r>
     </w:p>
     <w:tbl>
@@ -19973,253 +20217,6 @@
             <wp:extent cx="3810000" cy="3257550"/>
             <wp:effectExtent l="0" t="0" r="0" b="0"/>
             <wp:docPr id="1210488287" name="Picture 1210488287"/>
-            <wp:cNvGraphicFramePr>
-              <a:graphicFrameLocks xmlns:a="http://schemas.openxmlformats.org/drawingml/2006/main" noChangeAspect="1"/>
-            </wp:cNvGraphicFramePr>
-            <a:graphic xmlns:a="http://schemas.openxmlformats.org/drawingml/2006/main">
-              <a:graphicData uri="http://schemas.openxmlformats.org/drawingml/2006/picture">
-                <pic:pic xmlns:pic="http://schemas.openxmlformats.org/drawingml/2006/picture">
-                  <pic:nvPicPr>
-                    <pic:cNvPr id="0" name=""/>
-                    <pic:cNvPicPr>
-                      <a:picLocks noChangeAspect="1" noChangeArrowheads="1"/>
-                    </pic:cNvPicPr>
-                  </pic:nvPicPr>
-                  <pic:blipFill>
-                    <a:blip r:embed="rId26"/>
-                    <a:srcRect/>
-                    <a:stretch>
-                      <a:fillRect/>
-                    </a:stretch>
-                  </pic:blipFill>
-                  <pic:spPr bwMode="auto">
-                    <a:xfrm>
-                      <a:off x="0" y="0"/>
-                      <a:ext cx="3810000" cy="3257550"/>
-                    </a:xfrm>
-                    <a:prstGeom prst="rect">
-                      <a:avLst/>
-                    </a:prstGeom>
-                  </pic:spPr>
-                </pic:pic>
-              </a:graphicData>
-            </a:graphic>
-          </wp:inline>
-        </w:drawing>
-      </w:r>
-    </w:p>
-    <w:p>
-      <w:pPr>
-        <w:spacing w:before="80" w:after="240"/>
-        <w:jc w:val="center"/>
-      </w:pPr>
-      <w:r>
-        <w:rPr>
-          <w:i/>
-          <w:iCs/>
-          <w:color w:val="000000"/>
-          <w:sz w:val="20"/>
-          <w:szCs w:val="20"/>
-        </w:rPr>
-        <w:t>Слика 3.12 — Матрица конфузије за BERT</w:t>
-      </w:r>
-      <w:r>
-        <w:rPr>
-          <w:i/>
-          <w:iCs/>
-          <w:color w:val="000000"/>
-          <w:sz w:val="20"/>
-          <w:szCs w:val="20"/>
-        </w:rPr>
-        <w:t>ић</w:t>
-      </w:r>
-      <w:r>
-        <w:rPr>
-          <w:i/>
-          <w:iCs/>
-          <w:color w:val="000000"/>
-          <w:sz w:val="20"/>
-          <w:szCs w:val="20"/>
-        </w:rPr>
-        <w:t xml:space="preserve"> (epochs = 5)</w:t>
-      </w:r>
-    </w:p>
-    <w:p>
-      <w:pPr>
-        <w:spacing w:after="200"/>
-        <w:ind w:firstLine="720"/>
-        <w:jc w:val="both"/>
-      </w:pPr>
-      <w:r>
-        <w:rPr>
-          <w:color w:val="000000"/>
-        </w:rPr>
-        <w:t>Код BERT</w:t>
-      </w:r>
-      <w:r>
-        <w:rPr>
-          <w:color w:val="000000"/>
-        </w:rPr>
-        <w:t>ић</w:t>
-      </w:r>
-      <w:r>
-        <w:rPr>
-          <w:color w:val="000000"/>
-        </w:rPr>
-        <w:t>-а највише тачних предикција је на дијагонали: 306 за NEUTRAL, 758 за ZA-VLAST и 808 за PROTIV-VLASTI. Грешке код NEUTRAL најчешће одлазе у PROTIV-VLASTI (255) и ZA-VLAST (107), што потврђује да модел често „повуче“ неутрални коментар ка једном од два поларизована става</w:t>
-      </w:r>
-      <w:r>
-        <w:rPr>
-          <w:color w:val="000000"/>
-        </w:rPr>
-        <w:t>.</w:t>
-      </w:r>
-    </w:p>
-    <w:p>
-      <w:pPr>
-        <w:spacing w:before="160" w:after="80"/>
-        <w:jc w:val="center"/>
-      </w:pPr>
-      <w:r>
-        <w:rPr>
-          <w:noProof/>
-        </w:rPr>
-        <w:lastRenderedPageBreak/>
-        <w:drawing>
-          <wp:inline distT="0" distB="0" distL="0" distR="0" wp14:anchorId="4C7AF966" wp14:editId="24BEAA41">
-            <wp:extent cx="3810000" cy="3257550"/>
-            <wp:effectExtent l="0" t="0" r="0" b="0"/>
-            <wp:docPr id="711621108" name="Picture 711621108"/>
-            <wp:cNvGraphicFramePr>
-              <a:graphicFrameLocks xmlns:a="http://schemas.openxmlformats.org/drawingml/2006/main" noChangeAspect="1"/>
-            </wp:cNvGraphicFramePr>
-            <a:graphic xmlns:a="http://schemas.openxmlformats.org/drawingml/2006/main">
-              <a:graphicData uri="http://schemas.openxmlformats.org/drawingml/2006/picture">
-                <pic:pic xmlns:pic="http://schemas.openxmlformats.org/drawingml/2006/picture">
-                  <pic:nvPicPr>
-                    <pic:cNvPr id="0" name=""/>
-                    <pic:cNvPicPr>
-                      <a:picLocks noChangeAspect="1" noChangeArrowheads="1"/>
-                    </pic:cNvPicPr>
-                  </pic:nvPicPr>
-                  <pic:blipFill>
-                    <a:blip r:embed="rId27"/>
-                    <a:srcRect/>
-                    <a:stretch>
-                      <a:fillRect/>
-                    </a:stretch>
-                  </pic:blipFill>
-                  <pic:spPr bwMode="auto">
-                    <a:xfrm>
-                      <a:off x="0" y="0"/>
-                      <a:ext cx="3810000" cy="3257550"/>
-                    </a:xfrm>
-                    <a:prstGeom prst="rect">
-                      <a:avLst/>
-                    </a:prstGeom>
-                  </pic:spPr>
-                </pic:pic>
-              </a:graphicData>
-            </a:graphic>
-          </wp:inline>
-        </w:drawing>
-      </w:r>
-    </w:p>
-    <w:p>
-      <w:pPr>
-        <w:spacing w:before="80" w:after="240"/>
-        <w:jc w:val="center"/>
-      </w:pPr>
-      <w:r>
-        <w:rPr>
-          <w:i/>
-          <w:iCs/>
-          <w:color w:val="000000"/>
-          <w:sz w:val="20"/>
-          <w:szCs w:val="20"/>
-        </w:rPr>
-        <w:t>Слика 3.13 — Матрица конфузије за BERT</w:t>
-      </w:r>
-      <w:r>
-        <w:rPr>
-          <w:i/>
-          <w:iCs/>
-          <w:color w:val="000000"/>
-          <w:sz w:val="20"/>
-          <w:szCs w:val="20"/>
-        </w:rPr>
-        <w:t>ић</w:t>
-      </w:r>
-      <w:r>
-        <w:rPr>
-          <w:i/>
-          <w:iCs/>
-          <w:color w:val="000000"/>
-          <w:sz w:val="20"/>
-          <w:szCs w:val="20"/>
-        </w:rPr>
-        <w:t xml:space="preserve"> + class weights (epochs = 5)</w:t>
-      </w:r>
-    </w:p>
-    <w:p>
-      <w:pPr>
-        <w:spacing w:after="200"/>
-        <w:ind w:firstLine="720"/>
-        <w:jc w:val="both"/>
-      </w:pPr>
-      <w:r>
-        <w:rPr>
-          <w:color w:val="000000"/>
-        </w:rPr>
-        <w:t xml:space="preserve">Увођење </w:t>
-      </w:r>
-      <w:r>
-        <w:rPr>
-          <w:i/>
-          <w:iCs/>
-          <w:color w:val="000000"/>
-        </w:rPr>
-        <w:t>class weights</w:t>
-      </w:r>
-      <w:r>
-        <w:rPr>
-          <w:color w:val="000000"/>
-        </w:rPr>
-        <w:t xml:space="preserve"> код BERT</w:t>
-      </w:r>
-      <w:r>
-        <w:rPr>
-          <w:color w:val="000000"/>
-        </w:rPr>
-        <w:t>ић</w:t>
-      </w:r>
-      <w:r>
-        <w:rPr>
-          <w:color w:val="000000"/>
-        </w:rPr>
-        <w:t>-а видно смањује број погрешно класификованих NEUTRAL примера (тачних NEUTRAL предикција са 306 на 399, recall са 0,458 на 0,597), али по цену пораста лажно позитивних NEUTRAL предикција на рачун класе PROTIV-VLASTI (тачне PROTIV-VLASTI предикције падају</w:t>
-      </w:r>
-      <w:r>
-        <w:rPr>
-          <w:color w:val="000000"/>
-        </w:rPr>
-        <w:t xml:space="preserve"> са 808 на 700).</w:t>
-      </w:r>
-    </w:p>
-    <w:p>
-      <w:pPr>
-        <w:spacing w:before="160" w:after="80"/>
-        <w:jc w:val="center"/>
-      </w:pPr>
-      <w:r>
-        <w:rPr>
-          <w:noProof/>
-        </w:rPr>
-        <w:drawing>
-          <wp:inline distT="0" distB="0" distL="0" distR="0" wp14:anchorId="41963E2E" wp14:editId="3BDC37E3">
-            <wp:extent cx="3810000" cy="3257550"/>
-            <wp:effectExtent l="0" t="0" r="0" b="0"/>
-            <wp:docPr id="1579807810" name="Picture 1579807810"/>
             <wp:cNvGraphicFramePr>
               <a:graphicFrameLocks xmlns:a="http://schemas.openxmlformats.org/drawingml/2006/main" noChangeAspect="1"/>
             </wp:cNvGraphicFramePr>
@@ -20268,7 +20265,27 @@
           <w:sz w:val="20"/>
           <w:szCs w:val="20"/>
         </w:rPr>
-        <w:t>Слика 3.14 — Матрица конфузије за mBERT (epochs = 5)</w:t>
+        <w:t>Слика 3.12 — Матрица конфузије за BERT</w:t>
+      </w:r>
+      <w:r>
+        <w:rPr>
+          <w:i/>
+          <w:iCs/>
+          <w:color w:val="000000"/>
+          <w:sz w:val="20"/>
+          <w:szCs w:val="20"/>
+        </w:rPr>
+        <w:t>ић</w:t>
+      </w:r>
+      <w:r>
+        <w:rPr>
+          <w:i/>
+          <w:iCs/>
+          <w:color w:val="000000"/>
+          <w:sz w:val="20"/>
+          <w:szCs w:val="20"/>
+        </w:rPr>
+        <w:t xml:space="preserve"> (epochs = 5)</w:t>
       </w:r>
     </w:p>
     <w:p>
@@ -20281,8 +20298,7 @@
         <w:rPr>
           <w:color w:val="000000"/>
         </w:rPr>
-        <w:lastRenderedPageBreak/>
-        <w:t>Код mBERT-а образац грешака је сличан BERT</w:t>
+        <w:t>Код BERT</w:t>
       </w:r>
       <w:r>
         <w:rPr>
@@ -20294,7 +20310,13 @@
         <w:rPr>
           <w:color w:val="000000"/>
         </w:rPr>
-        <w:t>-у, али су дијагоналне вредности ниже (289 / 692 / 734). Посебно је израженије мешање NEUTRAL ↔ PROTIV-VLASTI и NEUTRAL ↔ ZA-VLAST.</w:t>
+        <w:t>-а највише тачних предикција је на дијагонали: 306 за NEUTRAL, 758 за ZA-VLAST и 808 за PROTIV-VLASTI. Грешке код NEUTRAL најчешће одлазе у PROTIV-VLASTI (255) и ZA-VLAST (107), што потврђује да модел често „повуче“ неутрални коментар ка једном од два поларизована става</w:t>
+      </w:r>
+      <w:r>
+        <w:rPr>
+          <w:color w:val="000000"/>
+        </w:rPr>
+        <w:t>.</w:t>
       </w:r>
     </w:p>
     <w:p>
@@ -20306,11 +20328,12 @@
         <w:rPr>
           <w:noProof/>
         </w:rPr>
+        <w:lastRenderedPageBreak/>
         <w:drawing>
-          <wp:inline distT="0" distB="0" distL="0" distR="0" wp14:anchorId="0A58DCC1" wp14:editId="0E199110">
+          <wp:inline distT="0" distB="0" distL="0" distR="0" wp14:anchorId="4C7AF966" wp14:editId="24BEAA41">
             <wp:extent cx="3810000" cy="3257550"/>
             <wp:effectExtent l="0" t="0" r="0" b="0"/>
-            <wp:docPr id="995822047" name="Picture 995822047"/>
+            <wp:docPr id="711621108" name="Picture 711621108"/>
             <wp:cNvGraphicFramePr>
               <a:graphicFrameLocks xmlns:a="http://schemas.openxmlformats.org/drawingml/2006/main" noChangeAspect="1"/>
             </wp:cNvGraphicFramePr>
@@ -20359,7 +20382,27 @@
           <w:sz w:val="20"/>
           <w:szCs w:val="20"/>
         </w:rPr>
-        <w:t>Слика 3.15 — Матрица конфузије за mBERT + class weights (epochs = 5)</w:t>
+        <w:t>Слика 3.13 — Матрица конфузије за BERT</w:t>
+      </w:r>
+      <w:r>
+        <w:rPr>
+          <w:i/>
+          <w:iCs/>
+          <w:color w:val="000000"/>
+          <w:sz w:val="20"/>
+          <w:szCs w:val="20"/>
+        </w:rPr>
+        <w:t>ић</w:t>
+      </w:r>
+      <w:r>
+        <w:rPr>
+          <w:i/>
+          <w:iCs/>
+          <w:color w:val="000000"/>
+          <w:sz w:val="20"/>
+          <w:szCs w:val="20"/>
+        </w:rPr>
+        <w:t xml:space="preserve"> + class weights (epochs = 5)</w:t>
       </w:r>
     </w:p>
     <w:p>
@@ -20367,27 +20410,12 @@
         <w:spacing w:after="200"/>
         <w:ind w:firstLine="720"/>
         <w:jc w:val="both"/>
-        <w:rPr>
-          <w:color w:val="000000"/>
-        </w:rPr>
-      </w:pPr>
-      <w:r>
-        <w:rPr>
-          <w:color w:val="000000"/>
-        </w:rPr>
-        <w:t>Слично као код BERT</w:t>
-      </w:r>
-      <w:r>
-        <w:rPr>
-          <w:color w:val="000000"/>
-        </w:rPr>
-        <w:t>ић</w:t>
-      </w:r>
-      <w:r>
-        <w:rPr>
-          <w:color w:val="000000"/>
-        </w:rPr>
-        <w:t xml:space="preserve">-а, </w:t>
+      </w:pPr>
+      <w:r>
+        <w:rPr>
+          <w:color w:val="000000"/>
+        </w:rPr>
+        <w:t xml:space="preserve">Увођење </w:t>
       </w:r>
       <w:r>
         <w:rPr>
@@ -20401,43 +20429,7 @@
         <w:rPr>
           <w:color w:val="000000"/>
         </w:rPr>
-        <w:t xml:space="preserve"> побољшавају NEUTRAL recall код mBERT-а (са 0,433 на 0,495), али смањују број тачних предикција на PROTIV-VLASTI (са 734 на 653). Поређењем св</w:t>
-      </w:r>
-      <w:r>
-        <w:rPr>
-          <w:color w:val="000000"/>
-        </w:rPr>
-        <w:t>е чет</w:t>
-      </w:r>
-      <w:r>
-        <w:rPr>
-          <w:color w:val="000000"/>
-        </w:rPr>
-        <w:t>и</w:t>
-      </w:r>
-      <w:r>
-        <w:rPr>
-          <w:color w:val="000000"/>
-        </w:rPr>
-        <w:t>ри</w:t>
-      </w:r>
-      <w:r>
-        <w:rPr>
-          <w:color w:val="000000"/>
-        </w:rPr>
-        <w:t xml:space="preserve"> матриц</w:t>
-      </w:r>
-      <w:r>
-        <w:rPr>
-          <w:color w:val="000000"/>
-        </w:rPr>
-        <w:t>е</w:t>
-      </w:r>
-      <w:r>
-        <w:rPr>
-          <w:color w:val="000000"/>
-        </w:rPr>
-        <w:t xml:space="preserve"> види се да BERT</w:t>
+        <w:t xml:space="preserve"> код BERT</w:t>
       </w:r>
       <w:r>
         <w:rPr>
@@ -20449,63 +20441,13 @@
         <w:rPr>
           <w:color w:val="000000"/>
         </w:rPr>
-        <w:t xml:space="preserve"> доследно боље одваја три класе од mBERT-а, независно од тога да ли се користе </w:t>
-      </w:r>
-      <w:r>
-        <w:rPr>
-          <w:i/>
-          <w:iCs/>
-          <w:color w:val="000000"/>
-        </w:rPr>
-        <w:t>class weights</w:t>
-      </w:r>
-      <w:r>
-        <w:rPr>
-          <w:color w:val="000000"/>
-        </w:rPr>
-        <w:t xml:space="preserve">, уз исти тип најчешћих грешака — проблем NEUTRAL класе није потпуно решен ни </w:t>
-      </w:r>
-      <w:r>
-        <w:rPr>
-          <w:i/>
-          <w:iCs/>
-          <w:color w:val="000000"/>
-        </w:rPr>
-        <w:t>Transformer</w:t>
-      </w:r>
-      <w:r>
-        <w:rPr>
-          <w:color w:val="000000"/>
-        </w:rPr>
-        <w:t xml:space="preserve"> архитектуром нити </w:t>
-      </w:r>
-      <w:r>
-        <w:rPr>
-          <w:i/>
-          <w:iCs/>
-          <w:color w:val="000000"/>
-        </w:rPr>
-        <w:t>class weights</w:t>
-      </w:r>
-      <w:r>
-        <w:rPr>
-          <w:color w:val="000000"/>
-        </w:rPr>
-        <w:t xml:space="preserve"> техником, али јесте значајно ублажен у односу на </w:t>
-      </w:r>
-      <w:r>
-        <w:rPr>
-          <w:i/>
-          <w:iCs/>
-          <w:color w:val="000000"/>
-        </w:rPr>
-        <w:t>baseline</w:t>
-      </w:r>
-      <w:r>
-        <w:rPr>
-          <w:color w:val="000000"/>
-        </w:rPr>
-        <w:t>.</w:t>
+        <w:t>-а видно смањује број погрешно класификованих NEUTRAL примера (тачних NEUTRAL предикција са 306 на 399, recall са 0,458 на 0,597), али по цену пораста лажно позитивних NEUTRAL предикција на рачун класе PROTIV-VLASTI (тачне PROTIV-VLASTI предикције падају</w:t>
+      </w:r>
+      <w:r>
+        <w:rPr>
+          <w:color w:val="000000"/>
+        </w:rPr>
+        <w:t xml:space="preserve"> са 808 на 700).</w:t>
       </w:r>
     </w:p>
     <w:p>
@@ -20518,10 +20460,10 @@
           <w:noProof/>
         </w:rPr>
         <w:drawing>
-          <wp:inline distT="0" distB="0" distL="0" distR="0" wp14:anchorId="05DEC817" wp14:editId="4EAED373">
-            <wp:extent cx="4762500" cy="2009775"/>
+          <wp:inline distT="0" distB="0" distL="0" distR="0" wp14:anchorId="41963E2E" wp14:editId="3BDC37E3">
+            <wp:extent cx="3810000" cy="3257550"/>
             <wp:effectExtent l="0" t="0" r="0" b="0"/>
-            <wp:docPr id="1146843963" name="Picture 1146843963"/>
+            <wp:docPr id="1579807810" name="Picture 1579807810"/>
             <wp:cNvGraphicFramePr>
               <a:graphicFrameLocks xmlns:a="http://schemas.openxmlformats.org/drawingml/2006/main" noChangeAspect="1"/>
             </wp:cNvGraphicFramePr>
@@ -20544,7 +20486,7 @@
                   <pic:spPr bwMode="auto">
                     <a:xfrm>
                       <a:off x="0" y="0"/>
-                      <a:ext cx="4762500" cy="2009775"/>
+                      <a:ext cx="3810000" cy="3257550"/>
                     </a:xfrm>
                     <a:prstGeom prst="rect">
                       <a:avLst/>
@@ -20570,7 +20512,7 @@
           <w:sz w:val="20"/>
           <w:szCs w:val="20"/>
         </w:rPr>
-        <w:t>Слика 3.16 — Рангирање четири енкодер конфигурације по macro-F1</w:t>
+        <w:t>Слика 3.14 — Матрица конфузије за mBERT (epochs = 5)</w:t>
       </w:r>
     </w:p>
     <w:p>
@@ -20583,7 +20525,8 @@
         <w:rPr>
           <w:color w:val="000000"/>
         </w:rPr>
-        <w:t>Слика 3.16 сумира коначно рангирање: 1) BERT</w:t>
+        <w:lastRenderedPageBreak/>
+        <w:t>Код mBERT-а образац грешака је сличан BERT</w:t>
       </w:r>
       <w:r>
         <w:rPr>
@@ -20595,80 +20538,7 @@
         <w:rPr>
           <w:color w:val="000000"/>
         </w:rPr>
-        <w:t xml:space="preserve"> + </w:t>
-      </w:r>
-      <w:r>
-        <w:rPr>
-          <w:i/>
-          <w:iCs/>
-          <w:color w:val="000000"/>
-        </w:rPr>
-        <w:t>class weights</w:t>
-      </w:r>
-      <w:r>
-        <w:rPr>
-          <w:color w:val="000000"/>
-        </w:rPr>
-        <w:t xml:space="preserve"> (0,637); 2) BERT</w:t>
-      </w:r>
-      <w:r>
-        <w:rPr>
-          <w:color w:val="000000"/>
-        </w:rPr>
-        <w:t>ић</w:t>
-      </w:r>
-      <w:r>
-        <w:rPr>
-          <w:color w:val="000000"/>
-        </w:rPr>
-        <w:t xml:space="preserve"> (0,630); 3) mBERT (0,577); 4) mBERT + </w:t>
-      </w:r>
-      <w:r>
-        <w:rPr>
-          <w:i/>
-          <w:iCs/>
-          <w:color w:val="000000"/>
-        </w:rPr>
-        <w:t>class weights</w:t>
-      </w:r>
-      <w:r>
-        <w:rPr>
-          <w:color w:val="000000"/>
-        </w:rPr>
-        <w:t xml:space="preserve"> (0,564). Пошто су </w:t>
-      </w:r>
-      <w:r>
-        <w:rPr>
-          <w:color w:val="000000"/>
-        </w:rPr>
-        <w:lastRenderedPageBreak/>
-        <w:t>хиперпараметри и протокол евалуације идентични за све конфигурације, разлика између BERT</w:t>
-      </w:r>
-      <w:r>
-        <w:rPr>
-          <w:color w:val="000000"/>
-        </w:rPr>
-        <w:t>ић</w:t>
-      </w:r>
-      <w:r>
-        <w:rPr>
-          <w:color w:val="000000"/>
-        </w:rPr>
-        <w:t xml:space="preserve"> и mBERT варијанти се може приписати самом претренираном моделу (монолингвални BCMS наспрам мултилингвалног BERT-а), а разлика унутар истог модела ефекту третмана неуравнотежености </w:t>
-      </w:r>
-      <w:r>
-        <w:rPr>
-          <w:i/>
-          <w:iCs/>
-          <w:color w:val="000000"/>
-        </w:rPr>
-        <w:t>class weights</w:t>
-      </w:r>
-      <w:r>
-        <w:rPr>
-          <w:color w:val="000000"/>
-        </w:rPr>
-        <w:t xml:space="preserve"> техником.</w:t>
+        <w:t>-у, али су дијагоналне вредности ниже (289 / 692 / 734). Посебно је израженије мешање NEUTRAL ↔ PROTIV-VLASTI и NEUTRAL ↔ ZA-VLAST.</w:t>
       </w:r>
     </w:p>
     <w:p>
@@ -20681,10 +20551,10 @@
           <w:noProof/>
         </w:rPr>
         <w:drawing>
-          <wp:inline distT="0" distB="0" distL="0" distR="0" wp14:anchorId="23F2CC5A" wp14:editId="34966FEA">
-            <wp:extent cx="4572000" cy="3057525"/>
+          <wp:inline distT="0" distB="0" distL="0" distR="0" wp14:anchorId="0A58DCC1" wp14:editId="0E199110">
+            <wp:extent cx="3810000" cy="3257550"/>
             <wp:effectExtent l="0" t="0" r="0" b="0"/>
-            <wp:docPr id="1814486525" name="Picture 1814486525"/>
+            <wp:docPr id="995822047" name="Picture 995822047"/>
             <wp:cNvGraphicFramePr>
               <a:graphicFrameLocks xmlns:a="http://schemas.openxmlformats.org/drawingml/2006/main" noChangeAspect="1"/>
             </wp:cNvGraphicFramePr>
@@ -20707,7 +20577,7 @@
                   <pic:spPr bwMode="auto">
                     <a:xfrm>
                       <a:off x="0" y="0"/>
-                      <a:ext cx="4572000" cy="3057525"/>
+                      <a:ext cx="3810000" cy="3257550"/>
                     </a:xfrm>
                     <a:prstGeom prst="rect">
                       <a:avLst/>
@@ -20733,7 +20603,7 @@
           <w:sz w:val="20"/>
           <w:szCs w:val="20"/>
         </w:rPr>
-        <w:t>Слика 3.17 — Утицај броја епоха (1–5) на macro-F1 за све четири конфигурације</w:t>
+        <w:t>Слика 3.15 — Матрица конфузије за mBERT + class weights (epochs = 5)</w:t>
       </w:r>
     </w:p>
     <w:p>
@@ -20741,24 +20611,15 @@
         <w:spacing w:after="200"/>
         <w:ind w:firstLine="720"/>
         <w:jc w:val="both"/>
-      </w:pPr>
-      <w:r>
-        <w:rPr>
-          <w:color w:val="000000"/>
-        </w:rPr>
-        <w:t xml:space="preserve">Слика 3.17 приказује утицај броја епоха на macro-F1. Све криве расту монотоно до 3.–4. епохе, а затим или </w:t>
-      </w:r>
-      <w:r>
-        <w:rPr>
-          <w:color w:val="000000"/>
-        </w:rPr>
-        <w:t>стагнирају</w:t>
-      </w:r>
-      <w:r>
-        <w:rPr>
-          <w:color w:val="000000"/>
-        </w:rPr>
-        <w:t xml:space="preserve"> или благо осцилују. BERT</w:t>
+        <w:rPr>
+          <w:color w:val="000000"/>
+        </w:rPr>
+      </w:pPr>
+      <w:r>
+        <w:rPr>
+          <w:color w:val="000000"/>
+        </w:rPr>
+        <w:t>Слично као код BERT</w:t>
       </w:r>
       <w:r>
         <w:rPr>
@@ -20770,7 +20631,7 @@
         <w:rPr>
           <w:color w:val="000000"/>
         </w:rPr>
-        <w:t xml:space="preserve"> + </w:t>
+        <w:t xml:space="preserve">-а, </w:t>
       </w:r>
       <w:r>
         <w:rPr>
@@ -20784,7 +20645,43 @@
         <w:rPr>
           <w:color w:val="000000"/>
         </w:rPr>
-        <w:t xml:space="preserve"> постиже високу вредност већ у 3. епохи (0,619) и наставља благи раст до 4. епохе (0,643), да би у 5. епохи благо опао (0,638). Основни BERT</w:t>
+        <w:t xml:space="preserve"> побољшавају NEUTRAL recall код mBERT-а (са 0,433 на 0,495), али смањују број тачних предикција на PROTIV-VLASTI (са 734 на 653). Поређењем св</w:t>
+      </w:r>
+      <w:r>
+        <w:rPr>
+          <w:color w:val="000000"/>
+        </w:rPr>
+        <w:t>е чет</w:t>
+      </w:r>
+      <w:r>
+        <w:rPr>
+          <w:color w:val="000000"/>
+        </w:rPr>
+        <w:t>и</w:t>
+      </w:r>
+      <w:r>
+        <w:rPr>
+          <w:color w:val="000000"/>
+        </w:rPr>
+        <w:t>ри</w:t>
+      </w:r>
+      <w:r>
+        <w:rPr>
+          <w:color w:val="000000"/>
+        </w:rPr>
+        <w:t xml:space="preserve"> матриц</w:t>
+      </w:r>
+      <w:r>
+        <w:rPr>
+          <w:color w:val="000000"/>
+        </w:rPr>
+        <w:t>е</w:t>
+      </w:r>
+      <w:r>
+        <w:rPr>
+          <w:color w:val="000000"/>
+        </w:rPr>
+        <w:t xml:space="preserve"> види се да BERT</w:t>
       </w:r>
       <w:r>
         <w:rPr>
@@ -20796,31 +20693,63 @@
         <w:rPr>
           <w:color w:val="000000"/>
         </w:rPr>
-        <w:t xml:space="preserve"> модел </w:t>
-      </w:r>
-      <w:r>
-        <w:rPr>
-          <w:color w:val="000000"/>
-        </w:rPr>
-        <w:t>има ниже вредности у прве две епохе</w:t>
-      </w:r>
-      <w:r>
-        <w:rPr>
-          <w:color w:val="000000"/>
-        </w:rPr>
-        <w:t>, али до 4.–5. епохе стиже готово на ниво class-weight варијанте. Обе mBERT конфигурације остају знатно испод BERT</w:t>
-      </w:r>
-      <w:r>
-        <w:rPr>
-          <w:color w:val="000000"/>
-        </w:rPr>
-        <w:t>ић</w:t>
-      </w:r>
-      <w:r>
-        <w:rPr>
-          <w:color w:val="000000"/>
-        </w:rPr>
-        <w:t xml:space="preserve"> конфигурација кроз све епохе, уз спорији и равномернији раст.</w:t>
+        <w:t xml:space="preserve"> доследно боље одваја три класе од mBERT-а, независно од тога да ли се користе </w:t>
+      </w:r>
+      <w:r>
+        <w:rPr>
+          <w:i/>
+          <w:iCs/>
+          <w:color w:val="000000"/>
+        </w:rPr>
+        <w:t>class weights</w:t>
+      </w:r>
+      <w:r>
+        <w:rPr>
+          <w:color w:val="000000"/>
+        </w:rPr>
+        <w:t xml:space="preserve">, уз исти тип најчешћих грешака — проблем NEUTRAL класе није потпуно решен ни </w:t>
+      </w:r>
+      <w:r>
+        <w:rPr>
+          <w:i/>
+          <w:iCs/>
+          <w:color w:val="000000"/>
+        </w:rPr>
+        <w:t>Transformer</w:t>
+      </w:r>
+      <w:r>
+        <w:rPr>
+          <w:color w:val="000000"/>
+        </w:rPr>
+        <w:t xml:space="preserve"> архитектуром нити </w:t>
+      </w:r>
+      <w:r>
+        <w:rPr>
+          <w:i/>
+          <w:iCs/>
+          <w:color w:val="000000"/>
+        </w:rPr>
+        <w:t>class weights</w:t>
+      </w:r>
+      <w:r>
+        <w:rPr>
+          <w:color w:val="000000"/>
+        </w:rPr>
+        <w:t xml:space="preserve"> техником, али јесте значајно ублажен у односу на </w:t>
+      </w:r>
+      <w:r>
+        <w:rPr>
+          <w:i/>
+          <w:iCs/>
+          <w:color w:val="000000"/>
+        </w:rPr>
+        <w:t>baseline</w:t>
+      </w:r>
+      <w:r>
+        <w:rPr>
+          <w:color w:val="000000"/>
+        </w:rPr>
+        <w:t>.</w:t>
       </w:r>
     </w:p>
     <w:p>
@@ -20833,10 +20762,10 @@
           <w:noProof/>
         </w:rPr>
         <w:drawing>
-          <wp:inline distT="0" distB="0" distL="0" distR="0" wp14:anchorId="0A5027F9" wp14:editId="401A2544">
-            <wp:extent cx="4953000" cy="2095500"/>
+          <wp:inline distT="0" distB="0" distL="0" distR="0" wp14:anchorId="05DEC817" wp14:editId="4EAED373">
+            <wp:extent cx="4762500" cy="2009775"/>
             <wp:effectExtent l="0" t="0" r="0" b="0"/>
-            <wp:docPr id="263374046" name="Picture 263374046"/>
+            <wp:docPr id="1146843963" name="Picture 1146843963"/>
             <wp:cNvGraphicFramePr>
               <a:graphicFrameLocks xmlns:a="http://schemas.openxmlformats.org/drawingml/2006/main" noChangeAspect="1"/>
             </wp:cNvGraphicFramePr>
@@ -20859,7 +20788,7 @@
                   <pic:spPr bwMode="auto">
                     <a:xfrm>
                       <a:off x="0" y="0"/>
-                      <a:ext cx="4953000" cy="2095500"/>
+                      <a:ext cx="4762500" cy="2009775"/>
                     </a:xfrm>
                     <a:prstGeom prst="rect">
                       <a:avLst/>
@@ -20885,17 +20814,7 @@
           <w:sz w:val="20"/>
           <w:szCs w:val="20"/>
         </w:rPr>
-        <w:t>Слика 3.18 — Ефекат броја епоха на macro-F1 и accuracy — BERT</w:t>
-      </w:r>
-      <w:r>
-        <w:rPr>
-          <w:i/>
-          <w:iCs/>
-          <w:color w:val="000000"/>
-          <w:sz w:val="20"/>
-          <w:szCs w:val="20"/>
-        </w:rPr>
-        <w:t>ић</w:t>
+        <w:t>Слика 3.16 — Рангирање четири енкодер конфигурације по macro-F1</w:t>
       </w:r>
     </w:p>
     <w:p>
@@ -20908,8 +20827,66 @@
         <w:rPr>
           <w:color w:val="000000"/>
         </w:rPr>
+        <w:t>Слика 3.16 сумира коначно рангирање: 1) BERT</w:t>
+      </w:r>
+      <w:r>
+        <w:rPr>
+          <w:color w:val="000000"/>
+        </w:rPr>
+        <w:t>ић</w:t>
+      </w:r>
+      <w:r>
+        <w:rPr>
+          <w:color w:val="000000"/>
+        </w:rPr>
+        <w:t xml:space="preserve"> + </w:t>
+      </w:r>
+      <w:r>
+        <w:rPr>
+          <w:i/>
+          <w:iCs/>
+          <w:color w:val="000000"/>
+        </w:rPr>
+        <w:t>class weights</w:t>
+      </w:r>
+      <w:r>
+        <w:rPr>
+          <w:color w:val="000000"/>
+        </w:rPr>
+        <w:t xml:space="preserve"> (0,637); 2) BERT</w:t>
+      </w:r>
+      <w:r>
+        <w:rPr>
+          <w:color w:val="000000"/>
+        </w:rPr>
+        <w:t>ић</w:t>
+      </w:r>
+      <w:r>
+        <w:rPr>
+          <w:color w:val="000000"/>
+        </w:rPr>
+        <w:t xml:space="preserve"> (0,630); 3) mBERT (0,577); 4) mBERT + </w:t>
+      </w:r>
+      <w:r>
+        <w:rPr>
+          <w:i/>
+          <w:iCs/>
+          <w:color w:val="000000"/>
+        </w:rPr>
+        <w:t>class weights</w:t>
+      </w:r>
+      <w:r>
+        <w:rPr>
+          <w:color w:val="000000"/>
+        </w:rPr>
+        <w:t xml:space="preserve"> (0,564). Пошто су </w:t>
+      </w:r>
+      <w:r>
+        <w:rPr>
+          <w:color w:val="000000"/>
+        </w:rPr>
         <w:lastRenderedPageBreak/>
-        <w:t>За основни BERT</w:t>
+        <w:t>хиперпараметри и протокол евалуације идентични за све конфигурације, разлика између BERT</w:t>
       </w:r>
       <w:r>
         <w:rPr>
@@ -20921,21 +20898,21 @@
         <w:rPr>
           <w:color w:val="000000"/>
         </w:rPr>
-        <w:t xml:space="preserve"> модел (Слика 3.18) macro-F1 расте са 0,390 (1 епоха) на 0,628 (5 епоха), а accuracy са 0,517 на 0,651. Најбољи резултат у оквиру ове конфигурације </w:t>
-      </w:r>
-      <w:r>
-        <w:rPr>
-          <w:b/>
-          <w:bCs/>
-          <w:color w:val="000000"/>
-        </w:rPr>
-        <w:t>постиже се управо у 5. епохи</w:t>
-      </w:r>
-      <w:r>
-        <w:rPr>
-          <w:color w:val="000000"/>
-        </w:rPr>
-        <w:t xml:space="preserve"> (macro-F1 0,6280; accuracy 0,6514), што оправдава избор 5 епоха у финалном протоколу.</w:t>
+        <w:t xml:space="preserve"> и mBERT варијанти се може приписати самом претренираном моделу (монолингвални BCMS наспрам мултилингвалног BERT-а), а разлика унутар истог модела ефекту третмана неуравнотежености </w:t>
+      </w:r>
+      <w:r>
+        <w:rPr>
+          <w:i/>
+          <w:iCs/>
+          <w:color w:val="000000"/>
+        </w:rPr>
+        <w:t>class weights</w:t>
+      </w:r>
+      <w:r>
+        <w:rPr>
+          <w:color w:val="000000"/>
+        </w:rPr>
+        <w:t xml:space="preserve"> техником.</w:t>
       </w:r>
     </w:p>
     <w:p>
@@ -20948,10 +20925,10 @@
           <w:noProof/>
         </w:rPr>
         <w:drawing>
-          <wp:inline distT="0" distB="0" distL="0" distR="0" wp14:anchorId="4614892E" wp14:editId="09798CC1">
-            <wp:extent cx="5436019" cy="2299854"/>
+          <wp:inline distT="0" distB="0" distL="0" distR="0" wp14:anchorId="23F2CC5A" wp14:editId="34966FEA">
+            <wp:extent cx="4572000" cy="3057525"/>
             <wp:effectExtent l="0" t="0" r="0" b="0"/>
-            <wp:docPr id="1201451338" name="Picture 1201451338"/>
+            <wp:docPr id="1814486525" name="Picture 1814486525"/>
             <wp:cNvGraphicFramePr>
               <a:graphicFrameLocks xmlns:a="http://schemas.openxmlformats.org/drawingml/2006/main" noChangeAspect="1"/>
             </wp:cNvGraphicFramePr>
@@ -20974,7 +20951,7 @@
                   <pic:spPr bwMode="auto">
                     <a:xfrm>
                       <a:off x="0" y="0"/>
-                      <a:ext cx="5443549" cy="2303040"/>
+                      <a:ext cx="4572000" cy="3057525"/>
                     </a:xfrm>
                     <a:prstGeom prst="rect">
                       <a:avLst/>
@@ -21000,27 +20977,7 @@
           <w:sz w:val="20"/>
           <w:szCs w:val="20"/>
         </w:rPr>
-        <w:t>Слика 3.19 — Ефекат броја епоха на macro-F1 и accuracy — BERT</w:t>
-      </w:r>
-      <w:r>
-        <w:rPr>
-          <w:i/>
-          <w:iCs/>
-          <w:color w:val="000000"/>
-          <w:sz w:val="20"/>
-          <w:szCs w:val="20"/>
-        </w:rPr>
-        <w:t>ић</w:t>
-      </w:r>
-      <w:r>
-        <w:rPr>
-          <w:i/>
-          <w:iCs/>
-          <w:color w:val="000000"/>
-          <w:sz w:val="20"/>
-          <w:szCs w:val="20"/>
-        </w:rPr>
-        <w:t xml:space="preserve"> + class weights</w:t>
+        <w:t>Слика 3.17 — Утицај броја епоха (1–5) на macro-F1 за све четири конфигурације</w:t>
       </w:r>
     </w:p>
     <w:p>
@@ -21033,7 +20990,19 @@
         <w:rPr>
           <w:color w:val="000000"/>
         </w:rPr>
-        <w:t>За BERT</w:t>
+        <w:t xml:space="preserve">Слика 3.17 приказује утицај броја епоха на macro-F1. Све криве расту монотоно до 3.–4. епохе, а затим или </w:t>
+      </w:r>
+      <w:r>
+        <w:rPr>
+          <w:color w:val="000000"/>
+        </w:rPr>
+        <w:t>стагнирају</w:t>
+      </w:r>
+      <w:r>
+        <w:rPr>
+          <w:color w:val="000000"/>
+        </w:rPr>
+        <w:t xml:space="preserve"> или благо осцилују. BERT</w:t>
       </w:r>
       <w:r>
         <w:rPr>
@@ -21059,7 +21028,43 @@
         <w:rPr>
           <w:color w:val="000000"/>
         </w:rPr>
-        <w:t xml:space="preserve"> (Слика 3.19) macro-F1 достиже максимум у 4. епохи (0,6431), а затим благо опада у 5. епохи (0,6374); accuracy достиже максимум такође у 4. епохи (0,6517) и остаје готово непромењена у 5. епохи (0,6479). Разлика је мала (испод 0,01 macro-F1 поена), па је ради упоредивости задржан једнообразан избор од 5 епоха за све конфигурације, уз напомену да би за ову конфигурацију 4 епохе биле маргинално боље.</w:t>
+        <w:t xml:space="preserve"> постиже високу вредност већ у 3. епохи (0,619) и наставља благи раст до 4. епохе (0,643), да би у 5. епохи благо опао (0,638). Основни BERT</w:t>
+      </w:r>
+      <w:r>
+        <w:rPr>
+          <w:color w:val="000000"/>
+        </w:rPr>
+        <w:t>ић</w:t>
+      </w:r>
+      <w:r>
+        <w:rPr>
+          <w:color w:val="000000"/>
+        </w:rPr>
+        <w:t xml:space="preserve"> модел </w:t>
+      </w:r>
+      <w:r>
+        <w:rPr>
+          <w:color w:val="000000"/>
+        </w:rPr>
+        <w:t>има ниже вредности у прве две епохе</w:t>
+      </w:r>
+      <w:r>
+        <w:rPr>
+          <w:color w:val="000000"/>
+        </w:rPr>
+        <w:t>, али до 4.–5. епохе стиже готово на ниво class-weight варијанте. Обе mBERT конфигурације остају знатно испод BERT</w:t>
+      </w:r>
+      <w:r>
+        <w:rPr>
+          <w:color w:val="000000"/>
+        </w:rPr>
+        <w:t>ић</w:t>
+      </w:r>
+      <w:r>
+        <w:rPr>
+          <w:color w:val="000000"/>
+        </w:rPr>
+        <w:t xml:space="preserve"> конфигурација кроз све епохе, уз спорији и равномернији раст.</w:t>
       </w:r>
     </w:p>
     <w:p>
@@ -21072,10 +21077,10 @@
           <w:noProof/>
         </w:rPr>
         <w:drawing>
-          <wp:inline distT="0" distB="0" distL="0" distR="0" wp14:anchorId="44E3741C" wp14:editId="6D7EC321">
-            <wp:extent cx="5648876" cy="2389909"/>
+          <wp:inline distT="0" distB="0" distL="0" distR="0" wp14:anchorId="0A5027F9" wp14:editId="401A2544">
+            <wp:extent cx="4953000" cy="2095500"/>
             <wp:effectExtent l="0" t="0" r="0" b="0"/>
-            <wp:docPr id="2011418577" name="Picture 2011418577"/>
+            <wp:docPr id="263374046" name="Picture 263374046"/>
             <wp:cNvGraphicFramePr>
               <a:graphicFrameLocks xmlns:a="http://schemas.openxmlformats.org/drawingml/2006/main" noChangeAspect="1"/>
             </wp:cNvGraphicFramePr>
@@ -21098,7 +21103,7 @@
                   <pic:spPr bwMode="auto">
                     <a:xfrm>
                       <a:off x="0" y="0"/>
-                      <a:ext cx="5659457" cy="2394386"/>
+                      <a:ext cx="4953000" cy="2095500"/>
                     </a:xfrm>
                     <a:prstGeom prst="rect">
                       <a:avLst/>
@@ -21124,7 +21129,17 @@
           <w:sz w:val="20"/>
           <w:szCs w:val="20"/>
         </w:rPr>
-        <w:t>Слика 3.20 — Ефекат броја епоха на macro-F1 и accuracy — mBERT</w:t>
+        <w:t>Слика 3.18 — Ефекат броја епоха на macro-F1 и accuracy — BERT</w:t>
+      </w:r>
+      <w:r>
+        <w:rPr>
+          <w:i/>
+          <w:iCs/>
+          <w:color w:val="000000"/>
+          <w:sz w:val="20"/>
+          <w:szCs w:val="20"/>
+        </w:rPr>
+        <w:t>ић</w:t>
       </w:r>
     </w:p>
     <w:p>
@@ -21132,24 +21147,39 @@
         <w:spacing w:after="200"/>
         <w:ind w:firstLine="720"/>
         <w:jc w:val="both"/>
+      </w:pPr>
+      <w:r>
+        <w:rPr>
+          <w:color w:val="000000"/>
+        </w:rPr>
+        <w:lastRenderedPageBreak/>
+        <w:t>За основни BERT</w:t>
+      </w:r>
+      <w:r>
+        <w:rPr>
+          <w:color w:val="000000"/>
+        </w:rPr>
+        <w:t>ић</w:t>
+      </w:r>
+      <w:r>
+        <w:rPr>
+          <w:color w:val="000000"/>
+        </w:rPr>
+        <w:t xml:space="preserve"> модел (Слика 3.18) macro-F1 расте са 0,390 (1 епоха) на 0,628 (5 епоха), а accuracy са 0,517 на 0,651. Најбољи резултат у оквиру ове конфигурације </w:t>
+      </w:r>
+      <w:r>
         <w:rPr>
           <w:b/>
           <w:bCs/>
-        </w:rPr>
-      </w:pPr>
-      <w:r>
-        <w:rPr>
-          <w:color w:val="000000"/>
-        </w:rPr>
-        <w:t xml:space="preserve">Код mBERT-а (Слика 3.20) обе метрике монотоно расту кроз свих 5 епоха, без изразитог платоа: macro-F1 иде од 0,473 до 0,576, а accuracy од 0,537 до 0,597, при чему су максималне вредности </w:t>
-      </w:r>
-      <w:r>
-        <w:rPr>
-          <w:b/>
-          <w:bCs/>
-          <w:color w:val="000000"/>
-        </w:rPr>
-        <w:t>управо у 5. епохи.</w:t>
+          <w:color w:val="000000"/>
+        </w:rPr>
+        <w:t>постиже се управо у 5. епохи</w:t>
+      </w:r>
+      <w:r>
+        <w:rPr>
+          <w:color w:val="000000"/>
+        </w:rPr>
+        <w:t xml:space="preserve"> (macro-F1 0,6280; accuracy 0,6514), што оправдава избор 5 епоха у финалном протоколу.</w:t>
       </w:r>
     </w:p>
     <w:p>
@@ -21161,12 +21191,11 @@
         <w:rPr>
           <w:noProof/>
         </w:rPr>
-        <w:lastRenderedPageBreak/>
         <w:drawing>
-          <wp:inline distT="0" distB="0" distL="0" distR="0" wp14:anchorId="09FB3557" wp14:editId="10D86255">
-            <wp:extent cx="5567009" cy="2355273"/>
+          <wp:inline distT="0" distB="0" distL="0" distR="0" wp14:anchorId="4614892E" wp14:editId="09798CC1">
+            <wp:extent cx="5436019" cy="2299854"/>
             <wp:effectExtent l="0" t="0" r="0" b="0"/>
-            <wp:docPr id="1673776917" name="Picture 1673776917"/>
+            <wp:docPr id="1201451338" name="Picture 1201451338"/>
             <wp:cNvGraphicFramePr>
               <a:graphicFrameLocks xmlns:a="http://schemas.openxmlformats.org/drawingml/2006/main" noChangeAspect="1"/>
             </wp:cNvGraphicFramePr>
@@ -21189,6 +21218,221 @@
                   <pic:spPr bwMode="auto">
                     <a:xfrm>
                       <a:off x="0" y="0"/>
+                      <a:ext cx="5443549" cy="2303040"/>
+                    </a:xfrm>
+                    <a:prstGeom prst="rect">
+                      <a:avLst/>
+                    </a:prstGeom>
+                  </pic:spPr>
+                </pic:pic>
+              </a:graphicData>
+            </a:graphic>
+          </wp:inline>
+        </w:drawing>
+      </w:r>
+    </w:p>
+    <w:p>
+      <w:pPr>
+        <w:spacing w:before="80" w:after="240"/>
+        <w:jc w:val="center"/>
+      </w:pPr>
+      <w:r>
+        <w:rPr>
+          <w:i/>
+          <w:iCs/>
+          <w:color w:val="000000"/>
+          <w:sz w:val="20"/>
+          <w:szCs w:val="20"/>
+        </w:rPr>
+        <w:t>Слика 3.19 — Ефекат броја епоха на macro-F1 и accuracy — BERT</w:t>
+      </w:r>
+      <w:r>
+        <w:rPr>
+          <w:i/>
+          <w:iCs/>
+          <w:color w:val="000000"/>
+          <w:sz w:val="20"/>
+          <w:szCs w:val="20"/>
+        </w:rPr>
+        <w:t>ић</w:t>
+      </w:r>
+      <w:r>
+        <w:rPr>
+          <w:i/>
+          <w:iCs/>
+          <w:color w:val="000000"/>
+          <w:sz w:val="20"/>
+          <w:szCs w:val="20"/>
+        </w:rPr>
+        <w:t xml:space="preserve"> + class weights</w:t>
+      </w:r>
+    </w:p>
+    <w:p>
+      <w:pPr>
+        <w:spacing w:after="200"/>
+        <w:ind w:firstLine="720"/>
+        <w:jc w:val="both"/>
+      </w:pPr>
+      <w:r>
+        <w:rPr>
+          <w:color w:val="000000"/>
+        </w:rPr>
+        <w:t>За BERT</w:t>
+      </w:r>
+      <w:r>
+        <w:rPr>
+          <w:color w:val="000000"/>
+        </w:rPr>
+        <w:t>ић</w:t>
+      </w:r>
+      <w:r>
+        <w:rPr>
+          <w:color w:val="000000"/>
+        </w:rPr>
+        <w:t xml:space="preserve"> + </w:t>
+      </w:r>
+      <w:r>
+        <w:rPr>
+          <w:i/>
+          <w:iCs/>
+          <w:color w:val="000000"/>
+        </w:rPr>
+        <w:t>class weights</w:t>
+      </w:r>
+      <w:r>
+        <w:rPr>
+          <w:color w:val="000000"/>
+        </w:rPr>
+        <w:t xml:space="preserve"> (Слика 3.19) macro-F1 достиже максимум у 4. епохи (0,6431), а затим благо опада у 5. епохи (0,6374); accuracy достиже максимум такође у 4. епохи (0,6517) и остаје готово непромењена у 5. епохи (0,6479). Разлика је мала (испод 0,01 macro-F1 поена), па је ради упоредивости задржан једнообразан избор од 5 епоха за све конфигурације, уз напомену да би за ову конфигурацију 4 епохе биле маргинално боље.</w:t>
+      </w:r>
+    </w:p>
+    <w:p>
+      <w:pPr>
+        <w:spacing w:before="160" w:after="80"/>
+        <w:jc w:val="center"/>
+      </w:pPr>
+      <w:r>
+        <w:rPr>
+          <w:noProof/>
+        </w:rPr>
+        <w:drawing>
+          <wp:inline distT="0" distB="0" distL="0" distR="0" wp14:anchorId="44E3741C" wp14:editId="6D7EC321">
+            <wp:extent cx="5648876" cy="2389909"/>
+            <wp:effectExtent l="0" t="0" r="0" b="0"/>
+            <wp:docPr id="2011418577" name="Picture 2011418577"/>
+            <wp:cNvGraphicFramePr>
+              <a:graphicFrameLocks xmlns:a="http://schemas.openxmlformats.org/drawingml/2006/main" noChangeAspect="1"/>
+            </wp:cNvGraphicFramePr>
+            <a:graphic xmlns:a="http://schemas.openxmlformats.org/drawingml/2006/main">
+              <a:graphicData uri="http://schemas.openxmlformats.org/drawingml/2006/picture">
+                <pic:pic xmlns:pic="http://schemas.openxmlformats.org/drawingml/2006/picture">
+                  <pic:nvPicPr>
+                    <pic:cNvPr id="0" name=""/>
+                    <pic:cNvPicPr>
+                      <a:picLocks noChangeAspect="1" noChangeArrowheads="1"/>
+                    </pic:cNvPicPr>
+                  </pic:nvPicPr>
+                  <pic:blipFill>
+                    <a:blip r:embed="rId36"/>
+                    <a:srcRect/>
+                    <a:stretch>
+                      <a:fillRect/>
+                    </a:stretch>
+                  </pic:blipFill>
+                  <pic:spPr bwMode="auto">
+                    <a:xfrm>
+                      <a:off x="0" y="0"/>
+                      <a:ext cx="5659457" cy="2394386"/>
+                    </a:xfrm>
+                    <a:prstGeom prst="rect">
+                      <a:avLst/>
+                    </a:prstGeom>
+                  </pic:spPr>
+                </pic:pic>
+              </a:graphicData>
+            </a:graphic>
+          </wp:inline>
+        </w:drawing>
+      </w:r>
+    </w:p>
+    <w:p>
+      <w:pPr>
+        <w:spacing w:before="80" w:after="240"/>
+        <w:jc w:val="center"/>
+      </w:pPr>
+      <w:r>
+        <w:rPr>
+          <w:i/>
+          <w:iCs/>
+          <w:color w:val="000000"/>
+          <w:sz w:val="20"/>
+          <w:szCs w:val="20"/>
+        </w:rPr>
+        <w:t>Слика 3.20 — Ефекат броја епоха на macro-F1 и accuracy — mBERT</w:t>
+      </w:r>
+    </w:p>
+    <w:p>
+      <w:pPr>
+        <w:spacing w:after="200"/>
+        <w:ind w:firstLine="720"/>
+        <w:jc w:val="both"/>
+        <w:rPr>
+          <w:b/>
+          <w:bCs/>
+        </w:rPr>
+      </w:pPr>
+      <w:r>
+        <w:rPr>
+          <w:color w:val="000000"/>
+        </w:rPr>
+        <w:t xml:space="preserve">Код mBERT-а (Слика 3.20) обе метрике монотоно расту кроз свих 5 епоха, без изразитог платоа: macro-F1 иде од 0,473 до 0,576, а accuracy од 0,537 до 0,597, при чему су максималне вредности </w:t>
+      </w:r>
+      <w:r>
+        <w:rPr>
+          <w:b/>
+          <w:bCs/>
+          <w:color w:val="000000"/>
+        </w:rPr>
+        <w:t>управо у 5. епохи.</w:t>
+      </w:r>
+    </w:p>
+    <w:p>
+      <w:pPr>
+        <w:spacing w:before="160" w:after="80"/>
+        <w:jc w:val="center"/>
+      </w:pPr>
+      <w:r>
+        <w:rPr>
+          <w:noProof/>
+        </w:rPr>
+        <w:lastRenderedPageBreak/>
+        <w:drawing>
+          <wp:inline distT="0" distB="0" distL="0" distR="0" wp14:anchorId="09FB3557" wp14:editId="10D86255">
+            <wp:extent cx="5567009" cy="2355273"/>
+            <wp:effectExtent l="0" t="0" r="0" b="0"/>
+            <wp:docPr id="1673776917" name="Picture 1673776917"/>
+            <wp:cNvGraphicFramePr>
+              <a:graphicFrameLocks xmlns:a="http://schemas.openxmlformats.org/drawingml/2006/main" noChangeAspect="1"/>
+            </wp:cNvGraphicFramePr>
+            <a:graphic xmlns:a="http://schemas.openxmlformats.org/drawingml/2006/main">
+              <a:graphicData uri="http://schemas.openxmlformats.org/drawingml/2006/picture">
+                <pic:pic xmlns:pic="http://schemas.openxmlformats.org/drawingml/2006/picture">
+                  <pic:nvPicPr>
+                    <pic:cNvPr id="0" name=""/>
+                    <pic:cNvPicPr>
+                      <a:picLocks noChangeAspect="1" noChangeArrowheads="1"/>
+                    </pic:cNvPicPr>
+                  </pic:nvPicPr>
+                  <pic:blipFill>
+                    <a:blip r:embed="rId37"/>
+                    <a:srcRect/>
+                    <a:stretch>
+                      <a:fillRect/>
+                    </a:stretch>
+                  </pic:blipFill>
+                  <pic:spPr bwMode="auto">
+                    <a:xfrm>
+                      <a:off x="0" y="0"/>
                       <a:ext cx="5570109" cy="2356585"/>
                     </a:xfrm>
                     <a:prstGeom prst="rect">
@@ -21308,7 +21552,7 @@
         <w:pStyle w:val="Heading2"/>
         <w:spacing w:before="300" w:after="160"/>
       </w:pPr>
-      <w:bookmarkStart w:id="31" w:name="_Toc239505130"/>
+      <w:bookmarkStart w:id="31" w:name="_Toc239590112"/>
       <w:r>
         <w:rPr>
           <w:color w:val="000000"/>
@@ -21563,7 +21807,7 @@
         <w:pStyle w:val="Heading1"/>
         <w:spacing w:before="300" w:after="160"/>
       </w:pPr>
-      <w:bookmarkStart w:id="32" w:name="_Toc239505131"/>
+      <w:bookmarkStart w:id="32" w:name="_Toc239590113"/>
       <w:r>
         <w:rPr>
           <w:color w:val="000000"/>
@@ -21773,7 +22017,25 @@
         <w:rPr>
           <w:color w:val="000000"/>
         </w:rPr>
-        <w:t xml:space="preserve"> — од прикупљања и анотације до упоредиве евалуације модела — као и емпиријски налаз да </w:t>
+        <w:t>,</w:t>
+      </w:r>
+      <w:r>
+        <w:rPr>
+          <w:color w:val="000000"/>
+        </w:rPr>
+        <w:t xml:space="preserve"> од прикупљања и анотације до упоредиве евалуације модела</w:t>
+      </w:r>
+      <w:r>
+        <w:rPr>
+          <w:color w:val="000000"/>
+        </w:rPr>
+        <w:t>,</w:t>
+      </w:r>
+      <w:r>
+        <w:rPr>
+          <w:color w:val="000000"/>
+        </w:rPr>
+        <w:t xml:space="preserve"> као и емпиријски налаз да </w:t>
       </w:r>
       <w:r>
         <w:rPr>
@@ -21857,13 +22119,107 @@
       </w:r>
     </w:p>
     <w:sectPr>
+      <w:footerReference w:type="default" r:id="rId38"/>
       <w:pgSz w:w="12240" w:h="15840"/>
       <w:pgMar w:top="1440" w:right="1440" w:bottom="1440" w:left="1440" w:header="720" w:footer="720" w:gutter="0"/>
+      <w:pgNumType w:start="0"/>
       <w:cols w:space="720"/>
+      <w:titlePg/>
       <w:docGrid w:linePitch="360"/>
     </w:sectPr>
   </w:body>
 </w:document>
+</file>
+
+<file path=word/endnotes.xml><?xml version="1.0" encoding="utf-8"?>
+<w:endnotes xmlns:wpc="http://schemas.microsoft.com/office/word/2010/wordprocessingCanvas" xmlns:cx="http://schemas.microsoft.com/office/drawing/2014/chartex" xmlns:cx1="http://schemas.microsoft.com/office/drawing/2015/9/8/chartex" xmlns:cx2="http://schemas.microsoft.com/office/drawing/2015/10/21/chartex" xmlns:cx3="http://schemas.microsoft.com/office/drawing/2016/5/9/chartex" xmlns:cx4="http://schemas.microsoft.com/office/drawing/2016/5/10/chartex" xmlns:cx5="http://schemas.microsoft.com/office/drawing/2016/5/11/chartex" xmlns:cx6="http://schemas.microsoft.com/office/drawing/2016/5/12/chartex" xmlns:cx7="http://schemas.microsoft.com/office/drawing/2016/5/13/chartex" xmlns:cx8="http://schemas.microsoft.com/office/drawing/2016/5/14/chartex" xmlns:mc="http://schemas.openxmlformats.org/markup-compatibility/2006" xmlns:aink="http://schemas.microsoft.com/office/drawing/2016/ink" xmlns:am3d="http://schemas.microsoft.com/office/drawing/2017/model3d" xmlns:o="urn:schemas-microsoft-com:office:office" xmlns:oel="http://schemas.microsoft.com/office/2019/extlst" xmlns:r="http://schemas.openxmlformats.org/officeDocument/2006/relationships" xmlns:m="http://schemas.openxmlformats.org/officeDocument/2006/math" xmlns:v="urn:schemas-microsoft-com:vml" xmlns:wp14="http://schemas.microsoft.com/office/word/2010/wordprocessingDrawing" xmlns:wp="http://schemas.openxmlformats.org/drawingml/2006/wordprocessingDrawing" xmlns:w10="urn:schemas-microsoft-com:office:word" xmlns:w="http://schemas.openxmlformats.org/wordprocessingml/2006/main" xmlns:w14="http://schemas.microsoft.com/office/word/2010/wordml" xmlns:w15="http://schemas.microsoft.com/office/word/2012/wordml" xmlns:w16cex="http://schemas.microsoft.com/office/word/2018/wordml/cex" xmlns:w16cid="http://schemas.microsoft.com/office/word/2016/wordml/cid" xmlns:w16="http://schemas.microsoft.com/office/word/2018/wordml" xmlns:w16du="http://schemas.microsoft.com/office/word/2023/wordml/word16du" xmlns:w16sdtdh="http://schemas.microsoft.com/office/word/2020/wordml/sdtdatahash" xmlns:w16sdtfl="http://schemas.microsoft.com/office/word/2024/wordml/sdtformatlock" xmlns:w16se="http://schemas.microsoft.com/office/word/2015/wordml/symex" xmlns:wpg="http://schemas.microsoft.com/office/word/2010/wordprocessingGroup" xmlns:wpi="http://schemas.microsoft.com/office/word/2010/wordprocessingInk" xmlns:wne="http://schemas.microsoft.com/office/word/2006/wordml" xmlns:wps="http://schemas.microsoft.com/office/word/2010/wordprocessingShape" mc:Ignorable="w14 w15 w16se w16cid w16 w16cex w16sdtdh w16sdtfl w16du wp14">
+  <w:endnote w:type="separator" w:id="-1">
+    <w:p>
+      <w:r>
+        <w:separator/>
+      </w:r>
+    </w:p>
+  </w:endnote>
+  <w:endnote w:type="continuationSeparator" w:id="0">
+    <w:p>
+      <w:r>
+        <w:continuationSeparator/>
+      </w:r>
+    </w:p>
+  </w:endnote>
+</w:endnotes>
+</file>
+
+<file path=word/footer1.xml><?xml version="1.0" encoding="utf-8"?>
+<w:ftr xmlns:wpc="http://schemas.microsoft.com/office/word/2010/wordprocessingCanvas" xmlns:cx="http://schemas.microsoft.com/office/drawing/2014/chartex" xmlns:cx1="http://schemas.microsoft.com/office/drawing/2015/9/8/chartex" xmlns:cx2="http://schemas.microsoft.com/office/drawing/2015/10/21/chartex" xmlns:cx3="http://schemas.microsoft.com/office/drawing/2016/5/9/chartex" xmlns:cx4="http://schemas.microsoft.com/office/drawing/2016/5/10/chartex" xmlns:cx5="http://schemas.microsoft.com/office/drawing/2016/5/11/chartex" xmlns:cx6="http://schemas.microsoft.com/office/drawing/2016/5/12/chartex" xmlns:cx7="http://schemas.microsoft.com/office/drawing/2016/5/13/chartex" xmlns:cx8="http://schemas.microsoft.com/office/drawing/2016/5/14/chartex" xmlns:mc="http://schemas.openxmlformats.org/markup-compatibility/2006" xmlns:aink="http://schemas.microsoft.com/office/drawing/2016/ink" xmlns:am3d="http://schemas.microsoft.com/office/drawing/2017/model3d" xmlns:o="urn:schemas-microsoft-com:office:office" xmlns:oel="http://schemas.microsoft.com/office/2019/extlst" xmlns:r="http://schemas.openxmlformats.org/officeDocument/2006/relationships" xmlns:m="http://schemas.openxmlformats.org/officeDocument/2006/math" xmlns:v="urn:schemas-microsoft-com:vml" xmlns:wp14="http://schemas.microsoft.com/office/word/2010/wordprocessingDrawing" xmlns:wp="http://schemas.openxmlformats.org/drawingml/2006/wordprocessingDrawing" xmlns:w10="urn:schemas-microsoft-com:office:word" xmlns:w="http://schemas.openxmlformats.org/wordprocessingml/2006/main" xmlns:w14="http://schemas.microsoft.com/office/word/2010/wordml" xmlns:w15="http://schemas.microsoft.com/office/word/2012/wordml" xmlns:w16cex="http://schemas.microsoft.com/office/word/2018/wordml/cex" xmlns:w16cid="http://schemas.microsoft.com/office/word/2016/wordml/cid" xmlns:w16="http://schemas.microsoft.com/office/word/2018/wordml" xmlns:w16du="http://schemas.microsoft.com/office/word/2023/wordml/word16du" xmlns:w16sdtdh="http://schemas.microsoft.com/office/word/2020/wordml/sdtdatahash" xmlns:w16sdtfl="http://schemas.microsoft.com/office/word/2024/wordml/sdtformatlock" xmlns:w16se="http://schemas.microsoft.com/office/word/2015/wordml/symex" xmlns:wpg="http://schemas.microsoft.com/office/word/2010/wordprocessingGroup" xmlns:wpi="http://schemas.microsoft.com/office/word/2010/wordprocessingInk" xmlns:wne="http://schemas.microsoft.com/office/word/2006/wordml" xmlns:wps="http://schemas.microsoft.com/office/word/2010/wordprocessingShape" mc:Ignorable="w14 w15 w16se w16cid w16 w16cex w16sdtdh w16sdtfl w16du wp14">
+  <w:sdt>
+    <w:sdtPr>
+      <w:id w:val="-314031283"/>
+      <w:docPartObj>
+        <w:docPartGallery w:val="Page Numbers (Bottom of Page)"/>
+        <w:docPartUnique/>
+      </w:docPartObj>
+    </w:sdtPr>
+    <w:sdtEndPr>
+      <w:rPr>
+        <w:noProof/>
+      </w:rPr>
+    </w:sdtEndPr>
+    <w:sdtContent>
+      <w:p>
+        <w:pPr>
+          <w:pStyle w:val="Footer"/>
+          <w:jc w:val="center"/>
+        </w:pPr>
+        <w:r>
+          <w:fldChar w:fldCharType="begin"/>
+        </w:r>
+        <w:r>
+          <w:instrText xml:space="preserve"> PAGE   \* MERGEFORMAT </w:instrText>
+        </w:r>
+        <w:r>
+          <w:fldChar w:fldCharType="separate"/>
+        </w:r>
+        <w:r>
+          <w:rPr>
+            <w:noProof/>
+          </w:rPr>
+          <w:t>2</w:t>
+        </w:r>
+        <w:r>
+          <w:rPr>
+            <w:noProof/>
+          </w:rPr>
+          <w:fldChar w:fldCharType="end"/>
+        </w:r>
+      </w:p>
+    </w:sdtContent>
+  </w:sdt>
+  <w:p>
+    <w:pPr>
+      <w:pStyle w:val="Footer"/>
+    </w:pPr>
+  </w:p>
+</w:ftr>
+</file>
+
+<file path=word/footnotes.xml><?xml version="1.0" encoding="utf-8"?>
+<w:footnotes xmlns:wpc="http://schemas.microsoft.com/office/word/2010/wordprocessingCanvas" xmlns:cx="http://schemas.microsoft.com/office/drawing/2014/chartex" xmlns:cx1="http://schemas.microsoft.com/office/drawing/2015/9/8/chartex" xmlns:cx2="http://schemas.microsoft.com/office/drawing/2015/10/21/chartex" xmlns:cx3="http://schemas.microsoft.com/office/drawing/2016/5/9/chartex" xmlns:cx4="http://schemas.microsoft.com/office/drawing/2016/5/10/chartex" xmlns:cx5="http://schemas.microsoft.com/office/drawing/2016/5/11/chartex" xmlns:cx6="http://schemas.microsoft.com/office/drawing/2016/5/12/chartex" xmlns:cx7="http://schemas.microsoft.com/office/drawing/2016/5/13/chartex" xmlns:cx8="http://schemas.microsoft.com/office/drawing/2016/5/14/chartex" xmlns:mc="http://schemas.openxmlformats.org/markup-compatibility/2006" xmlns:aink="http://schemas.microsoft.com/office/drawing/2016/ink" xmlns:am3d="http://schemas.microsoft.com/office/drawing/2017/model3d" xmlns:o="urn:schemas-microsoft-com:office:office" xmlns:oel="http://schemas.microsoft.com/office/2019/extlst" xmlns:r="http://schemas.openxmlformats.org/officeDocument/2006/relationships" xmlns:m="http://schemas.openxmlformats.org/officeDocument/2006/math" xmlns:v="urn:schemas-microsoft-com:vml" xmlns:wp14="http://schemas.microsoft.com/office/word/2010/wordprocessingDrawing" xmlns:wp="http://schemas.openxmlformats.org/drawingml/2006/wordprocessingDrawing" xmlns:w10="urn:schemas-microsoft-com:office:word" xmlns:w="http://schemas.openxmlformats.org/wordprocessingml/2006/main" xmlns:w14="http://schemas.microsoft.com/office/word/2010/wordml" xmlns:w15="http://schemas.microsoft.com/office/word/2012/wordml" xmlns:w16cex="http://schemas.microsoft.com/office/word/2018/wordml/cex" xmlns:w16cid="http://schemas.microsoft.com/office/word/2016/wordml/cid" xmlns:w16="http://schemas.microsoft.com/office/word/2018/wordml" xmlns:w16du="http://schemas.microsoft.com/office/word/2023/wordml/word16du" xmlns:w16sdtdh="http://schemas.microsoft.com/office/word/2020/wordml/sdtdatahash" xmlns:w16sdtfl="http://schemas.microsoft.com/office/word/2024/wordml/sdtformatlock" xmlns:w16se="http://schemas.microsoft.com/office/word/2015/wordml/symex" xmlns:wpg="http://schemas.microsoft.com/office/word/2010/wordprocessingGroup" xmlns:wpi="http://schemas.microsoft.com/office/word/2010/wordprocessingInk" xmlns:wne="http://schemas.microsoft.com/office/word/2006/wordml" xmlns:wps="http://schemas.microsoft.com/office/word/2010/wordprocessingShape" mc:Ignorable="w14 w15 w16se w16cid w16 w16cex w16sdtdh w16sdtfl w16du wp14">
+  <w:footnote w:type="separator" w:id="-1">
+    <w:p>
+      <w:r>
+        <w:separator/>
+      </w:r>
+    </w:p>
+  </w:footnote>
+  <w:footnote w:type="continuationSeparator" w:id="0">
+    <w:p>
+      <w:r>
+        <w:continuationSeparator/>
+      </w:r>
+    </w:p>
+  </w:footnote>
+</w:footnotes>
 </file>
 
 <file path=word/numbering.xml><?xml version="1.0" encoding="utf-8"?>
@@ -24401,6 +24757,7 @@
   <w:style w:type="character" w:default="1" w:styleId="DefaultParagraphFont">
     <w:name w:val="Default Paragraph Font"/>
     <w:uiPriority w:val="1"/>
+    <w:semiHidden/>
     <w:unhideWhenUsed/>
   </w:style>
   <w:style w:type="table" w:default="1" w:styleId="TableNormal">
@@ -26046,6 +26403,60 @@
       <w:shd w:val="clear" w:color="auto" w:fill="E1DFDD"/>
     </w:rPr>
   </w:style>
+  <w:style w:type="paragraph" w:styleId="Header">
+    <w:name w:val="header"/>
+    <w:basedOn w:val="Normal"/>
+    <w:link w:val="HeaderChar"/>
+    <w:uiPriority w:val="99"/>
+    <w:unhideWhenUsed/>
+    <w:rsid w:val="008F2884"/>
+    <w:pPr>
+      <w:tabs>
+        <w:tab w:val="center" w:pos="4680"/>
+        <w:tab w:val="right" w:pos="9360"/>
+      </w:tabs>
+    </w:pPr>
+  </w:style>
+  <w:style w:type="character" w:customStyle="1" w:styleId="HeaderChar">
+    <w:name w:val="Header Char"/>
+    <w:basedOn w:val="DefaultParagraphFont"/>
+    <w:link w:val="Header"/>
+    <w:uiPriority w:val="99"/>
+    <w:rsid w:val="008F2884"/>
+    <w:rPr>
+      <w:rFonts w:ascii="Times New Roman" w:eastAsia="Times New Roman" w:hAnsi="Times New Roman" w:cs="Times New Roman"/>
+      <w:sz w:val="24"/>
+      <w:szCs w:val="24"/>
+      <w:lang w:val="en-GB"/>
+    </w:rPr>
+  </w:style>
+  <w:style w:type="paragraph" w:styleId="Footer">
+    <w:name w:val="footer"/>
+    <w:basedOn w:val="Normal"/>
+    <w:link w:val="FooterChar"/>
+    <w:uiPriority w:val="99"/>
+    <w:unhideWhenUsed/>
+    <w:rsid w:val="008F2884"/>
+    <w:pPr>
+      <w:tabs>
+        <w:tab w:val="center" w:pos="4680"/>
+        <w:tab w:val="right" w:pos="9360"/>
+      </w:tabs>
+    </w:pPr>
+  </w:style>
+  <w:style w:type="character" w:customStyle="1" w:styleId="FooterChar">
+    <w:name w:val="Footer Char"/>
+    <w:basedOn w:val="DefaultParagraphFont"/>
+    <w:link w:val="Footer"/>
+    <w:uiPriority w:val="99"/>
+    <w:rsid w:val="008F2884"/>
+    <w:rPr>
+      <w:rFonts w:ascii="Times New Roman" w:eastAsia="Times New Roman" w:hAnsi="Times New Roman" w:cs="Times New Roman"/>
+      <w:sz w:val="24"/>
+      <w:szCs w:val="24"/>
+      <w:lang w:val="en-GB"/>
+    </w:rPr>
+  </w:style>
 </w:styles>
 </file>
 

</xml_diff>